<commit_message>
refactor: rename project to NAS_Jetson_Nano
</commit_message>
<xml_diff>
--- a/docs/articles/habr_v3.docx
+++ b/docs/articles/habr_v3.docx
@@ -3102,12 +3102,7 @@
         <w:spacing w:after="0"/>
       </w:pPr>
       <w:r>
-        <w:rPr>
-          <w:rFonts w:ascii="Courier New" w:hAnsi="Courier New"/>
-          <w:sz w:val="18"/>
-        </w:rPr>
-        <w:lastRenderedPageBreak/>
-        <w:t xml:space="preserve">    NASA API     :8099</w:t>
+        <w:t xml:space="preserve">    NAS_Jetson_Nano API     :8099</w:t>
       </w:r>
     </w:p>
     <w:p>
@@ -3847,11 +3842,7 @@
         <w:spacing w:after="40"/>
       </w:pPr>
       <w:r>
-        <w:rPr>
-          <w:rFonts w:ascii="Courier New" w:hAnsi="Courier New"/>
-          <w:sz w:val="18"/>
-        </w:rPr>
-        <w:t>nasa_api   custom FastAPI   8099   128m</w:t>
+        <w:t>nas_jetson_nano_api   custom FastAPI   8099   128m</w:t>
       </w:r>
     </w:p>
     <w:p>
@@ -4738,11 +4729,7 @@
         <w:spacing w:after="0"/>
       </w:pPr>
       <w:r>
-        <w:rPr>
-          <w:rFonts w:ascii="Courier New" w:hAnsi="Courier New"/>
-          <w:sz w:val="18"/>
-        </w:rPr>
-        <w:t>NASA HOME CLOUD — Daily Report</w:t>
+        <w:t>NAS_JETSON_NANO — Daily Report</w:t>
       </w:r>
     </w:p>
     <w:p>
@@ -4777,11 +4764,7 @@
         <w:spacing w:after="0"/>
       </w:pPr>
       <w:r>
-        <w:rPr>
-          <w:rFonts w:ascii="Courier New" w:hAnsi="Courier New"/>
-          <w:sz w:val="18"/>
-        </w:rPr>
-        <w:t>SYSTEM — nasa-jetson</w:t>
+        <w:t>SYSTEM — nas_jetson_nano-jetson</w:t>
       </w:r>
     </w:p>
     <w:p>
@@ -5658,11 +5641,7 @@
         <w:spacing w:after="0"/>
       </w:pPr>
       <w:r>
-        <w:rPr>
-          <w:rFonts w:ascii="Courier New" w:hAnsi="Courier New"/>
-          <w:sz w:val="18"/>
-        </w:rPr>
-        <w:t xml:space="preserve">  -keyout /opt/nasa/nginx/ssl/nasa.key \</w:t>
+        <w:t xml:space="preserve">  -keyout /opt/nas_jetson_nano/nginx/ssl/nas_jetson_nano.key \</w:t>
       </w:r>
     </w:p>
     <w:p>
@@ -5671,11 +5650,7 @@
         <w:spacing w:after="0"/>
       </w:pPr>
       <w:r>
-        <w:rPr>
-          <w:rFonts w:ascii="Courier New" w:hAnsi="Courier New"/>
-          <w:sz w:val="18"/>
-        </w:rPr>
-        <w:t xml:space="preserve">  -out /opt/nasa/nginx/ssl/nasa.crt \</w:t>
+        <w:t xml:space="preserve">  -out /opt/nas_jetson_nano/nginx/ssl/nas_jetson_nano.crt \</w:t>
       </w:r>
     </w:p>
     <w:p>
@@ -5684,11 +5659,7 @@
         <w:spacing w:after="0"/>
       </w:pPr>
       <w:r>
-        <w:rPr>
-          <w:rFonts w:ascii="Courier New" w:hAnsi="Courier New"/>
-          <w:sz w:val="18"/>
-        </w:rPr>
-        <w:t xml:space="preserve">  -subj "/CN=nasa-home-cloud" \</w:t>
+        <w:t xml:space="preserve">  -subj "/CN=nas-jetson-nano" \</w:t>
       </w:r>
     </w:p>
     <w:p>
@@ -6563,34 +6534,7 @@
         </w:rPr>
       </w:pPr>
       <w:r>
-        <w:rPr>
-          <w:color w:val="0F3C78"/>
-          <w:sz w:val="24"/>
-          <w:lang w:val="ru-RU"/>
-        </w:rPr>
-        <w:t xml:space="preserve">Шаг 7 — </w:t>
-      </w:r>
-      <w:r>
-        <w:rPr>
-          <w:color w:val="0F3C78"/>
-          <w:sz w:val="24"/>
-        </w:rPr>
-        <w:t>NASA</w:t>
-      </w:r>
-      <w:r>
-        <w:rPr>
-          <w:color w:val="0F3C78"/>
-          <w:sz w:val="24"/>
-          <w:lang w:val="ru-RU"/>
-        </w:rPr>
-        <w:t xml:space="preserve"> </w:t>
-      </w:r>
-      <w:r>
-        <w:rPr>
-          <w:color w:val="0F3C78"/>
-          <w:sz w:val="24"/>
-        </w:rPr>
-        <w:t>API</w:t>
+        <w:t>Шаг 7 — NAS_Jetson_Nano API</w:t>
       </w:r>
     </w:p>
     <w:p>
@@ -6973,6 +6917,240 @@
           <w:lang w:val="ru-RU"/>
         </w:rPr>
         <w:t>:</w:t>
+      </w:r>
+    </w:p>
+    <w:p>
+      <w:pPr>
+        <w:jc w:val="center"/>
+        <w:rPr>
+          <w:lang w:val="ru-RU"/>
+        </w:rPr>
+      </w:pPr>
+      <w:r>
+        <w:t>[Скриншот: NAS_Jetson_Nano API v0.6.0 — Swagger UI с группами эндпоинтов]</w:t>
+      </w:r>
+    </w:p>
+    <w:p>
+      <w:pPr>
+        <w:spacing w:after="40"/>
+        <w:rPr>
+          <w:lang w:val="ru-RU"/>
+        </w:rPr>
+      </w:pPr>
+      <w:r>
+        <w:rPr>
+          <w:rFonts w:ascii="Courier New" w:hAnsi="Courier New"/>
+          <w:sz w:val="18"/>
+          <w:lang w:val="ru-RU"/>
+        </w:rPr>
+        <w:t xml:space="preserve">Группа   Примеры </w:t>
+      </w:r>
+      <w:proofErr w:type="spellStart"/>
+      <w:r>
+        <w:rPr>
+          <w:rFonts w:ascii="Courier New" w:hAnsi="Courier New"/>
+          <w:sz w:val="18"/>
+          <w:lang w:val="ru-RU"/>
+        </w:rPr>
+        <w:t>эндпоинтов</w:t>
+      </w:r>
+      <w:proofErr w:type="spellEnd"/>
+    </w:p>
+    <w:p>
+      <w:pPr>
+        <w:spacing w:after="40"/>
+        <w:rPr>
+          <w:lang w:val="ru-RU"/>
+        </w:rPr>
+      </w:pPr>
+      <w:r>
+        <w:rPr>
+          <w:rFonts w:ascii="Courier New" w:hAnsi="Courier New"/>
+          <w:sz w:val="18"/>
+          <w:lang w:val="ru-RU"/>
+        </w:rPr>
+        <w:t xml:space="preserve">Система   </w:t>
+      </w:r>
+      <w:r>
+        <w:rPr>
+          <w:rFonts w:ascii="Courier New" w:hAnsi="Courier New"/>
+          <w:sz w:val="18"/>
+        </w:rPr>
+        <w:t>RAM</w:t>
+      </w:r>
+      <w:r>
+        <w:rPr>
+          <w:rFonts w:ascii="Courier New" w:hAnsi="Courier New"/>
+          <w:sz w:val="18"/>
+          <w:lang w:val="ru-RU"/>
+        </w:rPr>
+        <w:t xml:space="preserve">, </w:t>
+      </w:r>
+      <w:r>
+        <w:rPr>
+          <w:rFonts w:ascii="Courier New" w:hAnsi="Courier New"/>
+          <w:sz w:val="18"/>
+        </w:rPr>
+        <w:t>CPU</w:t>
+      </w:r>
+      <w:r>
+        <w:rPr>
+          <w:rFonts w:ascii="Courier New" w:hAnsi="Courier New"/>
+          <w:sz w:val="18"/>
+          <w:lang w:val="ru-RU"/>
+        </w:rPr>
+        <w:t>, температура, список контейнеров</w:t>
+      </w:r>
+    </w:p>
+    <w:p>
+      <w:pPr>
+        <w:spacing w:after="40"/>
+        <w:rPr>
+          <w:lang w:val="ru-RU"/>
+        </w:rPr>
+      </w:pPr>
+      <w:r>
+        <w:rPr>
+          <w:rFonts w:ascii="Courier New" w:hAnsi="Courier New"/>
+          <w:sz w:val="18"/>
+        </w:rPr>
+        <w:t>Talk</w:t>
+      </w:r>
+      <w:r>
+        <w:rPr>
+          <w:rFonts w:ascii="Courier New" w:hAnsi="Courier New"/>
+          <w:sz w:val="18"/>
+          <w:lang w:val="ru-RU"/>
+        </w:rPr>
+        <w:t xml:space="preserve">   Список чатов, участники, отправка сообщений</w:t>
+      </w:r>
+    </w:p>
+    <w:p>
+      <w:pPr>
+        <w:spacing w:after="40"/>
+        <w:rPr>
+          <w:lang w:val="ru-RU"/>
+        </w:rPr>
+      </w:pPr>
+      <w:r>
+        <w:rPr>
+          <w:rFonts w:ascii="Courier New" w:hAnsi="Courier New"/>
+          <w:sz w:val="18"/>
+          <w:lang w:val="ru-RU"/>
+        </w:rPr>
+        <w:t xml:space="preserve">Пользователи   Семейные аккаунты, </w:t>
+      </w:r>
+      <w:r>
+        <w:rPr>
+          <w:rFonts w:ascii="Courier New" w:hAnsi="Courier New"/>
+          <w:sz w:val="18"/>
+          <w:lang w:val="ru-RU"/>
+        </w:rPr>
+        <w:t xml:space="preserve">личные сообщения через </w:t>
+      </w:r>
+      <w:r>
+        <w:rPr>
+          <w:rFonts w:ascii="Courier New" w:hAnsi="Courier New"/>
+          <w:sz w:val="18"/>
+        </w:rPr>
+        <w:t>Talk</w:t>
+      </w:r>
+    </w:p>
+    <w:p>
+      <w:pPr>
+        <w:spacing w:after="40"/>
+        <w:rPr>
+          <w:lang w:val="ru-RU"/>
+        </w:rPr>
+      </w:pPr>
+      <w:r>
+        <w:rPr>
+          <w:rFonts w:ascii="Courier New" w:hAnsi="Courier New"/>
+          <w:sz w:val="18"/>
+          <w:lang w:val="ru-RU"/>
+        </w:rPr>
+        <w:t xml:space="preserve">Фото   Статистика </w:t>
+      </w:r>
+      <w:proofErr w:type="spellStart"/>
+      <w:r>
+        <w:rPr>
+          <w:rFonts w:ascii="Courier New" w:hAnsi="Courier New"/>
+          <w:sz w:val="18"/>
+        </w:rPr>
+        <w:t>Immich</w:t>
+      </w:r>
+      <w:proofErr w:type="spellEnd"/>
+      <w:r>
+        <w:rPr>
+          <w:rFonts w:ascii="Courier New" w:hAnsi="Courier New"/>
+          <w:sz w:val="18"/>
+          <w:lang w:val="ru-RU"/>
+        </w:rPr>
+        <w:t xml:space="preserve">: 6 484 фото, 210 видео, 4.24 </w:t>
+      </w:r>
+      <w:r>
+        <w:rPr>
+          <w:rFonts w:ascii="Courier New" w:hAnsi="Courier New"/>
+          <w:sz w:val="18"/>
+        </w:rPr>
+        <w:t>GB</w:t>
+      </w:r>
+    </w:p>
+    <w:p>
+      <w:pPr>
+        <w:spacing w:after="40"/>
+        <w:rPr>
+          <w:lang w:val="ru-RU"/>
+        </w:rPr>
+      </w:pPr>
+      <w:r>
+        <w:rPr>
+          <w:rFonts w:ascii="Courier New" w:hAnsi="Courier New"/>
+          <w:sz w:val="18"/>
+          <w:lang w:val="ru-RU"/>
+        </w:rPr>
+        <w:t xml:space="preserve">Действия   </w:t>
+      </w:r>
+      <w:r>
+        <w:rPr>
+          <w:rFonts w:ascii="Courier New" w:hAnsi="Courier New"/>
+          <w:sz w:val="18"/>
+        </w:rPr>
+        <w:t>Restart</w:t>
+      </w:r>
+      <w:r>
+        <w:rPr>
+          <w:rFonts w:ascii="Courier New" w:hAnsi="Courier New"/>
+          <w:sz w:val="18"/>
+          <w:lang w:val="ru-RU"/>
+        </w:rPr>
+        <w:t xml:space="preserve"> контейнера, бэкап по запросу</w:t>
+      </w:r>
+    </w:p>
+    <w:p>
+      <w:pPr>
+        <w:pBdr>
+          <w:bottom w:val="single" w:sz="6" w:space="1" w:color="CCCCCC"/>
+        </w:pBdr>
+        <w:rPr>
+          <w:lang w:val="ru-RU"/>
+        </w:rPr>
+      </w:pPr>
+    </w:p>
+    <w:p>
+      <w:pPr>
+        <w:pStyle w:val="1"/>
+        <w:rPr>
+          <w:lang w:val="ru-RU"/>
+        </w:rPr>
+      </w:pPr>
+      <w:r>
+        <w:rPr>
+          <w:color w:val="16213E"/>
+          <w:sz w:val="30"/>
+          <w:lang w:val="ru-RU"/>
+        </w:rPr>
+        <w:t>Что получилось: итоговая картина</w:t>
       </w:r>
     </w:p>
     <w:p>
@@ -6991,14 +7169,16 @@
         </w:rPr>
         <w:t xml:space="preserve">[Скриншот: </w:t>
       </w:r>
+      <w:proofErr w:type="spellStart"/>
       <w:r>
         <w:rPr>
           <w:i/>
           <w:color w:val="888888"/>
           <w:sz w:val="20"/>
         </w:rPr>
-        <w:t>NASA</w:t>
-      </w:r>
+        <w:t>Immich</w:t>
+      </w:r>
+      <w:proofErr w:type="spellEnd"/>
       <w:r>
         <w:rPr>
           <w:i/>
@@ -7006,7 +7186,7 @@
           <w:sz w:val="20"/>
           <w:lang w:val="ru-RU"/>
         </w:rPr>
-        <w:t xml:space="preserve"> </w:t>
+        <w:t xml:space="preserve"> — фотоархив семьи (6.1 </w:t>
       </w:r>
       <w:r>
         <w:rPr>
@@ -7014,7 +7194,7 @@
           <w:color w:val="888888"/>
           <w:sz w:val="20"/>
         </w:rPr>
-        <w:t>API</w:t>
+        <w:t>GiB</w:t>
       </w:r>
       <w:r>
         <w:rPr>
@@ -7023,7 +7203,7 @@
           <w:sz w:val="20"/>
           <w:lang w:val="ru-RU"/>
         </w:rPr>
-        <w:t xml:space="preserve"> </w:t>
+        <w:t xml:space="preserve">, 228 </w:t>
       </w:r>
       <w:r>
         <w:rPr>
@@ -7031,7 +7211,7 @@
           <w:color w:val="888888"/>
           <w:sz w:val="20"/>
         </w:rPr>
-        <w:t>v</w:t>
+        <w:t>GB</w:t>
       </w:r>
       <w:r>
         <w:rPr>
@@ -7040,258 +7220,354 @@
           <w:sz w:val="20"/>
           <w:lang w:val="ru-RU"/>
         </w:rPr>
-        <w:t xml:space="preserve">0.6.0 — </w:t>
-      </w:r>
-      <w:r>
-        <w:rPr>
-          <w:i/>
-          <w:color w:val="888888"/>
+        <w:t xml:space="preserve"> свободно)]</w:t>
+      </w:r>
+    </w:p>
+    <w:p>
+      <w:pPr>
+        <w:spacing w:after="120"/>
+        <w:rPr>
+          <w:lang w:val="ru-RU"/>
+        </w:rPr>
+      </w:pPr>
+      <w:r>
+        <w:rPr>
+          <w:b/>
+          <w:lang w:val="ru-RU"/>
+        </w:rPr>
+        <w:t>Цифры по итогу:</w:t>
+      </w:r>
+    </w:p>
+    <w:p>
+      <w:pPr>
+        <w:spacing w:after="120"/>
+        <w:rPr>
+          <w:lang w:val="ru-RU"/>
+        </w:rPr>
+      </w:pPr>
+      <w:r>
+        <w:rPr>
+          <w:lang w:val="ru-RU"/>
+        </w:rPr>
+        <w:t xml:space="preserve">- 13 </w:t>
+      </w:r>
+      <w:r>
+        <w:t>Dock</w:t>
+      </w:r>
+      <w:r>
+        <w:t>er</w:t>
+      </w:r>
+      <w:r>
+        <w:rPr>
+          <w:lang w:val="ru-RU"/>
+        </w:rPr>
+        <w:t xml:space="preserve">-контейнеров, все </w:t>
+      </w:r>
+      <w:r>
+        <w:rPr>
+          <w:rFonts w:ascii="Courier New" w:hAnsi="Courier New"/>
           <w:sz w:val="20"/>
         </w:rPr>
-        <w:t>Swagger</w:t>
-      </w:r>
-      <w:r>
-        <w:rPr>
-          <w:i/>
-          <w:color w:val="888888"/>
+        <w:t>up</w:t>
+      </w:r>
+      <w:r>
+        <w:rPr>
+          <w:rFonts w:ascii="Courier New" w:hAnsi="Courier New"/>
           <w:sz w:val="20"/>
           <w:lang w:val="ru-RU"/>
         </w:rPr>
+        <w:t>/</w:t>
+      </w:r>
+      <w:r>
+        <w:rPr>
+          <w:rFonts w:ascii="Courier New" w:hAnsi="Courier New"/>
+          <w:sz w:val="20"/>
+        </w:rPr>
+        <w:t>healthy</w:t>
+      </w:r>
+    </w:p>
+    <w:p>
+      <w:pPr>
+        <w:spacing w:after="120"/>
+        <w:rPr>
+          <w:lang w:val="ru-RU"/>
+        </w:rPr>
+      </w:pPr>
+      <w:r>
+        <w:rPr>
+          <w:lang w:val="ru-RU"/>
+        </w:rPr>
+        <w:t>- 6 697 фотографий и видео загружено с телефона</w:t>
+      </w:r>
+    </w:p>
+    <w:p>
+      <w:pPr>
+        <w:spacing w:after="120"/>
+        <w:rPr>
+          <w:lang w:val="ru-RU"/>
+        </w:rPr>
+      </w:pPr>
+      <w:r>
+        <w:rPr>
+          <w:lang w:val="ru-RU"/>
+        </w:rPr>
+        <w:t>- 2 151 контакт синхронизируется</w:t>
+      </w:r>
+    </w:p>
+    <w:p>
+      <w:pPr>
+        <w:spacing w:after="120"/>
+        <w:rPr>
+          <w:lang w:val="ru-RU"/>
+        </w:rPr>
+      </w:pPr>
+      <w:r>
+        <w:rPr>
+          <w:lang w:val="ru-RU"/>
+        </w:rPr>
+        <w:t>- 5 членов семьи в чате</w:t>
+      </w:r>
+    </w:p>
+    <w:p>
+      <w:pPr>
+        <w:spacing w:after="120"/>
+        <w:rPr>
+          <w:lang w:val="ru-RU"/>
+        </w:rPr>
+      </w:pPr>
+      <w:r>
+        <w:rPr>
+          <w:lang w:val="ru-RU"/>
+        </w:rPr>
+        <w:t xml:space="preserve">- </w:t>
+      </w:r>
+      <w:proofErr w:type="spellStart"/>
+      <w:r>
+        <w:t>goss</w:t>
+      </w:r>
+      <w:proofErr w:type="spellEnd"/>
+      <w:r>
+        <w:rPr>
+          <w:lang w:val="ru-RU"/>
+        </w:rPr>
+        <w:t xml:space="preserve"> 40/40 — инфраструктурные тесты</w:t>
+      </w:r>
+    </w:p>
+    <w:p>
+      <w:pPr>
+        <w:spacing w:after="120"/>
+        <w:rPr>
+          <w:lang w:val="ru-RU"/>
+        </w:rPr>
+      </w:pPr>
+      <w:r>
+        <w:rPr>
+          <w:lang w:val="ru-RU"/>
+        </w:rPr>
+        <w:t xml:space="preserve">- </w:t>
+      </w:r>
+      <w:r>
+        <w:t>Write</w:t>
+      </w:r>
+      <w:r>
+        <w:rPr>
+          <w:lang w:val="ru-RU"/>
+        </w:rPr>
+        <w:t xml:space="preserve"> 250 </w:t>
+      </w:r>
+      <w:r>
+        <w:t>MB</w:t>
+      </w:r>
+      <w:r>
+        <w:rPr>
+          <w:lang w:val="ru-RU"/>
+        </w:rPr>
+        <w:t>/</w:t>
+      </w:r>
+      <w:r>
+        <w:t>s</w:t>
+      </w:r>
+      <w:r>
+        <w:rPr>
+          <w:lang w:val="ru-RU"/>
+        </w:rPr>
+        <w:t xml:space="preserve">, </w:t>
+      </w:r>
+      <w:r>
+        <w:t>Read</w:t>
+      </w:r>
+      <w:r>
+        <w:rPr>
+          <w:lang w:val="ru-RU"/>
+        </w:rPr>
+        <w:t xml:space="preserve"> 172 </w:t>
+      </w:r>
+      <w:r>
+        <w:t>MB</w:t>
+      </w:r>
+      <w:r>
+        <w:rPr>
+          <w:lang w:val="ru-RU"/>
+        </w:rPr>
+        <w:t>/</w:t>
+      </w:r>
+      <w:r>
+        <w:t>s</w:t>
+      </w:r>
+      <w:r>
+        <w:rPr>
+          <w:lang w:val="ru-RU"/>
+        </w:rPr>
+        <w:t xml:space="preserve"> на </w:t>
+      </w:r>
+      <w:r>
+        <w:t>SSD</w:t>
+      </w:r>
+    </w:p>
+    <w:p>
+      <w:pPr>
+        <w:spacing w:after="120"/>
+        <w:rPr>
+          <w:lang w:val="ru-RU"/>
+        </w:rPr>
+      </w:pPr>
+      <w:r>
+        <w:rPr>
+          <w:b/>
+          <w:lang w:val="ru-RU"/>
+        </w:rPr>
+        <w:t>Что заменили:</w:t>
+      </w:r>
+    </w:p>
+    <w:p>
+      <w:pPr>
+        <w:spacing w:after="120"/>
+        <w:rPr>
+          <w:lang w:val="ru-RU"/>
+        </w:rPr>
+      </w:pPr>
+      <w:r>
+        <w:rPr>
+          <w:lang w:val="ru-RU"/>
+        </w:rPr>
+        <w:lastRenderedPageBreak/>
+        <w:t xml:space="preserve">- </w:t>
+      </w:r>
+      <w:r>
+        <w:t>Google</w:t>
+      </w:r>
+      <w:r>
+        <w:rPr>
+          <w:lang w:val="ru-RU"/>
+        </w:rPr>
         <w:t xml:space="preserve"> </w:t>
       </w:r>
       <w:r>
-        <w:rPr>
-          <w:i/>
-          <w:color w:val="888888"/>
-          <w:sz w:val="20"/>
-        </w:rPr>
-        <w:t>UI</w:t>
-      </w:r>
-      <w:r>
-        <w:rPr>
-          <w:i/>
-          <w:color w:val="888888"/>
-          <w:sz w:val="20"/>
-          <w:lang w:val="ru-RU"/>
-        </w:rPr>
-        <w:t xml:space="preserve"> с группами </w:t>
+        <w:t>Photos</w:t>
+      </w:r>
+      <w:r>
+        <w:rPr>
+          <w:lang w:val="ru-RU"/>
+        </w:rPr>
+        <w:t xml:space="preserve"> → </w:t>
       </w:r>
       <w:proofErr w:type="spellStart"/>
       <w:r>
-        <w:rPr>
-          <w:i/>
-          <w:color w:val="888888"/>
-          <w:sz w:val="20"/>
-          <w:lang w:val="ru-RU"/>
-        </w:rPr>
-        <w:t>эндпоинтов</w:t>
+        <w:t>Immich</w:t>
       </w:r>
       <w:proofErr w:type="spellEnd"/>
       <w:r>
         <w:rPr>
-          <w:i/>
-          <w:color w:val="888888"/>
-          <w:sz w:val="20"/>
-          <w:lang w:val="ru-RU"/>
-        </w:rPr>
-        <w:t>]</w:t>
-      </w:r>
-    </w:p>
-    <w:p>
-      <w:pPr>
-        <w:spacing w:after="40"/>
-        <w:rPr>
-          <w:lang w:val="ru-RU"/>
-        </w:rPr>
-      </w:pPr>
-      <w:r>
-        <w:rPr>
-          <w:rFonts w:ascii="Courier New" w:hAnsi="Courier New"/>
-          <w:sz w:val="18"/>
-          <w:lang w:val="ru-RU"/>
-        </w:rPr>
-        <w:t xml:space="preserve">Группа   Примеры </w:t>
+          <w:lang w:val="ru-RU"/>
+        </w:rPr>
+        <w:t xml:space="preserve"> (</w:t>
       </w:r>
       <w:proofErr w:type="spellStart"/>
       <w:r>
         <w:rPr>
-          <w:rFonts w:ascii="Courier New" w:hAnsi="Courier New"/>
-          <w:sz w:val="18"/>
-          <w:lang w:val="ru-RU"/>
-        </w:rPr>
-        <w:t>эндпоинтов</w:t>
+          <w:lang w:val="ru-RU"/>
+        </w:rPr>
+        <w:t>автобэкап</w:t>
       </w:r>
       <w:proofErr w:type="spellEnd"/>
-    </w:p>
-    <w:p>
-      <w:pPr>
-        <w:spacing w:after="40"/>
-        <w:rPr>
-          <w:lang w:val="ru-RU"/>
-        </w:rPr>
-      </w:pPr>
-      <w:r>
-        <w:rPr>
-          <w:rFonts w:ascii="Courier New" w:hAnsi="Courier New"/>
-          <w:sz w:val="18"/>
-          <w:lang w:val="ru-RU"/>
-        </w:rPr>
-        <w:t xml:space="preserve">Система   </w:t>
-      </w:r>
-      <w:r>
-        <w:rPr>
-          <w:rFonts w:ascii="Courier New" w:hAnsi="Courier New"/>
-          <w:sz w:val="18"/>
-        </w:rPr>
-        <w:t>RAM</w:t>
-      </w:r>
-      <w:r>
-        <w:rPr>
-          <w:rFonts w:ascii="Courier New" w:hAnsi="Courier New"/>
-          <w:sz w:val="18"/>
-          <w:lang w:val="ru-RU"/>
-        </w:rPr>
-        <w:t xml:space="preserve">, </w:t>
-      </w:r>
-      <w:r>
-        <w:rPr>
-          <w:rFonts w:ascii="Courier New" w:hAnsi="Courier New"/>
-          <w:sz w:val="18"/>
-        </w:rPr>
-        <w:t>CPU</w:t>
-      </w:r>
-      <w:r>
-        <w:rPr>
-          <w:rFonts w:ascii="Courier New" w:hAnsi="Courier New"/>
-          <w:sz w:val="18"/>
-          <w:lang w:val="ru-RU"/>
-        </w:rPr>
-        <w:t>, температура, список контейнеров</w:t>
-      </w:r>
-    </w:p>
-    <w:p>
-      <w:pPr>
-        <w:spacing w:after="40"/>
-        <w:rPr>
-          <w:lang w:val="ru-RU"/>
-        </w:rPr>
-      </w:pPr>
-      <w:r>
-        <w:rPr>
-          <w:rFonts w:ascii="Courier New" w:hAnsi="Courier New"/>
-          <w:sz w:val="18"/>
-        </w:rPr>
-        <w:t>Talk</w:t>
-      </w:r>
-      <w:r>
-        <w:rPr>
-          <w:rFonts w:ascii="Courier New" w:hAnsi="Courier New"/>
-          <w:sz w:val="18"/>
-          <w:lang w:val="ru-RU"/>
-        </w:rPr>
-        <w:t xml:space="preserve">   Список чатов, участники, отправка сообщений</w:t>
-      </w:r>
-    </w:p>
-    <w:p>
-      <w:pPr>
-        <w:spacing w:after="40"/>
-        <w:rPr>
-          <w:lang w:val="ru-RU"/>
-        </w:rPr>
-      </w:pPr>
-      <w:r>
-        <w:rPr>
-          <w:rFonts w:ascii="Courier New" w:hAnsi="Courier New"/>
-          <w:sz w:val="18"/>
-          <w:lang w:val="ru-RU"/>
-        </w:rPr>
-        <w:t xml:space="preserve">Пользователи   Семейные аккаунты, </w:t>
-      </w:r>
-      <w:r>
-        <w:rPr>
-          <w:rFonts w:ascii="Courier New" w:hAnsi="Courier New"/>
-          <w:sz w:val="18"/>
-          <w:lang w:val="ru-RU"/>
-        </w:rPr>
-        <w:t xml:space="preserve">личные сообщения через </w:t>
-      </w:r>
-      <w:r>
-        <w:rPr>
-          <w:rFonts w:ascii="Courier New" w:hAnsi="Courier New"/>
-          <w:sz w:val="18"/>
-        </w:rPr>
-        <w:t>Talk</w:t>
-      </w:r>
-    </w:p>
-    <w:p>
-      <w:pPr>
-        <w:spacing w:after="40"/>
-        <w:rPr>
-          <w:lang w:val="ru-RU"/>
-        </w:rPr>
-      </w:pPr>
-      <w:r>
-        <w:rPr>
-          <w:rFonts w:ascii="Courier New" w:hAnsi="Courier New"/>
-          <w:sz w:val="18"/>
-          <w:lang w:val="ru-RU"/>
-        </w:rPr>
-        <w:t xml:space="preserve">Фото   Статистика </w:t>
+      <w:r>
+        <w:rPr>
+          <w:lang w:val="ru-RU"/>
+        </w:rPr>
+        <w:t>, поиск, альбомы)</w:t>
+      </w:r>
+    </w:p>
+    <w:p>
+      <w:pPr>
+        <w:spacing w:after="120"/>
+        <w:rPr>
+          <w:lang w:val="ru-RU"/>
+        </w:rPr>
+      </w:pPr>
+      <w:r>
+        <w:rPr>
+          <w:lang w:val="ru-RU"/>
+        </w:rPr>
+        <w:t xml:space="preserve">- </w:t>
+      </w:r>
+      <w:r>
+        <w:t>Google</w:t>
+      </w:r>
+      <w:r>
+        <w:rPr>
+          <w:lang w:val="ru-RU"/>
+        </w:rPr>
+        <w:t xml:space="preserve"> </w:t>
+      </w:r>
+      <w:r>
+        <w:t>Drive</w:t>
+      </w:r>
+      <w:r>
+        <w:rPr>
+          <w:lang w:val="ru-RU"/>
+        </w:rPr>
+        <w:t xml:space="preserve"> / </w:t>
       </w:r>
       <w:proofErr w:type="spellStart"/>
       <w:r>
         <w:rPr>
-          <w:rFonts w:ascii="Courier New" w:hAnsi="Courier New"/>
-          <w:sz w:val="18"/>
-        </w:rPr>
-        <w:t>Immich</w:t>
+          <w:lang w:val="ru-RU"/>
+        </w:rPr>
+        <w:t>Яндекс.Диск</w:t>
       </w:r>
       <w:proofErr w:type="spellEnd"/>
       <w:r>
         <w:rPr>
-          <w:rFonts w:ascii="Courier New" w:hAnsi="Courier New"/>
-          <w:sz w:val="18"/>
-          <w:lang w:val="ru-RU"/>
-        </w:rPr>
-        <w:t xml:space="preserve">: 6 484 фото, 210 видео, 4.24 </w:t>
-      </w:r>
-      <w:r>
-        <w:rPr>
-          <w:rFonts w:ascii="Courier New" w:hAnsi="Courier New"/>
-          <w:sz w:val="18"/>
-        </w:rPr>
-        <w:t>GB</w:t>
-      </w:r>
-    </w:p>
-    <w:p>
-      <w:pPr>
-        <w:spacing w:after="40"/>
-        <w:rPr>
-          <w:lang w:val="ru-RU"/>
-        </w:rPr>
-      </w:pPr>
-      <w:r>
-        <w:rPr>
-          <w:rFonts w:ascii="Courier New" w:hAnsi="Courier New"/>
-          <w:sz w:val="18"/>
-          <w:lang w:val="ru-RU"/>
-        </w:rPr>
-        <w:t xml:space="preserve">Действия   </w:t>
-      </w:r>
-      <w:r>
-        <w:rPr>
-          <w:rFonts w:ascii="Courier New" w:hAnsi="Courier New"/>
-          <w:sz w:val="18"/>
-        </w:rPr>
-        <w:t>Restart</w:t>
-      </w:r>
-      <w:r>
-        <w:rPr>
-          <w:rFonts w:ascii="Courier New" w:hAnsi="Courier New"/>
-          <w:sz w:val="18"/>
-          <w:lang w:val="ru-RU"/>
-        </w:rPr>
-        <w:t xml:space="preserve"> контейнера, бэкап по запросу</w:t>
+          <w:lang w:val="ru-RU"/>
+        </w:rPr>
+        <w:t xml:space="preserve"> → </w:t>
+      </w:r>
+      <w:proofErr w:type="spellStart"/>
+      <w:r>
+        <w:t>Nextcloud</w:t>
+      </w:r>
+      <w:proofErr w:type="spellEnd"/>
+      <w:r>
+        <w:rPr>
+          <w:lang w:val="ru-RU"/>
+        </w:rPr>
+        <w:t xml:space="preserve"> (файлы, синхронизация)</w:t>
+      </w:r>
+    </w:p>
+    <w:p>
+      <w:pPr>
+        <w:spacing w:after="120"/>
+      </w:pPr>
+      <w:r>
+        <w:t>- Google Contacts → DAVx⁵ + Nextcloud (CardDAV)</w:t>
+      </w:r>
+    </w:p>
+    <w:p>
+      <w:pPr>
+        <w:spacing w:after="120"/>
+      </w:pPr>
+      <w:r>
+        <w:t>- WhatsApp/Telegram-группы → Nextcloud Talk (история на своём SSD)</w:t>
       </w:r>
     </w:p>
     <w:p>
@@ -7299,9 +7575,6 @@
         <w:pBdr>
           <w:bottom w:val="single" w:sz="6" w:space="1" w:color="CCCCCC"/>
         </w:pBdr>
-        <w:rPr>
-          <w:lang w:val="ru-RU"/>
-        </w:rPr>
       </w:pPr>
     </w:p>
     <w:p>
@@ -7317,77 +7590,759 @@
           <w:sz w:val="30"/>
           <w:lang w:val="ru-RU"/>
         </w:rPr>
-        <w:t>Что получилось: итоговая картина</w:t>
-      </w:r>
-    </w:p>
-    <w:p>
-      <w:pPr>
-        <w:jc w:val="center"/>
-        <w:rPr>
-          <w:lang w:val="ru-RU"/>
-        </w:rPr>
-      </w:pPr>
-      <w:r>
-        <w:rPr>
-          <w:i/>
-          <w:color w:val="888888"/>
+        <w:t xml:space="preserve">Честная оценка </w:t>
+      </w:r>
+      <w:r>
+        <w:rPr>
+          <w:color w:val="16213E"/>
+          <w:sz w:val="30"/>
+        </w:rPr>
+        <w:t>AI</w:t>
+      </w:r>
+      <w:r>
+        <w:rPr>
+          <w:color w:val="16213E"/>
+          <w:sz w:val="30"/>
+          <w:lang w:val="ru-RU"/>
+        </w:rPr>
+        <w:t>-</w:t>
+      </w:r>
+      <w:r>
+        <w:rPr>
+          <w:color w:val="16213E"/>
+          <w:sz w:val="30"/>
+        </w:rPr>
+        <w:t>assisted</w:t>
+      </w:r>
+      <w:r>
+        <w:rPr>
+          <w:color w:val="16213E"/>
+          <w:sz w:val="30"/>
+          <w:lang w:val="ru-RU"/>
+        </w:rPr>
+        <w:t xml:space="preserve"> подхода</w:t>
+      </w:r>
+    </w:p>
+    <w:p>
+      <w:pPr>
+        <w:spacing w:after="120"/>
+        <w:rPr>
+          <w:lang w:val="ru-RU"/>
+        </w:rPr>
+      </w:pPr>
+      <w:r>
+        <w:rPr>
+          <w:b/>
+          <w:lang w:val="ru-RU"/>
+        </w:rPr>
+        <w:t>Что по</w:t>
+      </w:r>
+      <w:r>
+        <w:rPr>
+          <w:b/>
+          <w:lang w:val="ru-RU"/>
+        </w:rPr>
+        <w:t>лучилось хорошо:</w:t>
+      </w:r>
+    </w:p>
+    <w:p>
+      <w:pPr>
+        <w:spacing w:after="120"/>
+        <w:rPr>
+          <w:lang w:val="ru-RU"/>
+        </w:rPr>
+      </w:pPr>
+      <w:r>
+        <w:rPr>
+          <w:lang w:val="ru-RU"/>
+        </w:rPr>
+        <w:t>*</w:t>
+      </w:r>
+      <w:proofErr w:type="gramStart"/>
+      <w:r>
+        <w:rPr>
+          <w:lang w:val="ru-RU"/>
+        </w:rPr>
+        <w:t>Скорость.*</w:t>
+      </w:r>
+      <w:proofErr w:type="gramEnd"/>
+      <w:r>
+        <w:rPr>
+          <w:lang w:val="ru-RU"/>
+        </w:rPr>
+        <w:t xml:space="preserve"> </w:t>
+      </w:r>
+      <w:proofErr w:type="spellStart"/>
+      <w:r>
+        <w:t>systemd</w:t>
+      </w:r>
+      <w:proofErr w:type="spellEnd"/>
+      <w:r>
+        <w:rPr>
+          <w:lang w:val="ru-RU"/>
+        </w:rPr>
+        <w:t xml:space="preserve">-юниты, </w:t>
+      </w:r>
+      <w:proofErr w:type="spellStart"/>
+      <w:r>
+        <w:t>udev</w:t>
+      </w:r>
+      <w:proofErr w:type="spellEnd"/>
+      <w:r>
+        <w:rPr>
+          <w:lang w:val="ru-RU"/>
+        </w:rPr>
+        <w:t xml:space="preserve">-правила, </w:t>
+      </w:r>
+      <w:proofErr w:type="spellStart"/>
+      <w:r>
+        <w:t>nginx</w:t>
+      </w:r>
+      <w:proofErr w:type="spellEnd"/>
+      <w:r>
+        <w:rPr>
+          <w:lang w:val="ru-RU"/>
+        </w:rPr>
+        <w:t xml:space="preserve">-конфиги, </w:t>
+      </w:r>
+      <w:r>
+        <w:t>Docker</w:t>
+      </w:r>
+      <w:r>
+        <w:rPr>
+          <w:lang w:val="ru-RU"/>
+        </w:rPr>
+        <w:t xml:space="preserve"> </w:t>
+      </w:r>
+      <w:r>
+        <w:t>Compose</w:t>
+      </w:r>
+      <w:r>
+        <w:rPr>
+          <w:lang w:val="ru-RU"/>
+        </w:rPr>
+        <w:t xml:space="preserve"> — агент пишет это параллельно, не забывая про детали (</w:t>
+      </w:r>
+      <w:r>
+        <w:t>mem</w:t>
+      </w:r>
+      <w:r>
+        <w:rPr>
+          <w:lang w:val="ru-RU"/>
+        </w:rPr>
+        <w:t>_</w:t>
+      </w:r>
+      <w:r>
+        <w:t>limit</w:t>
+      </w:r>
+      <w:r>
+        <w:rPr>
+          <w:lang w:val="ru-RU"/>
+        </w:rPr>
+        <w:t xml:space="preserve">, </w:t>
+      </w:r>
+      <w:r>
+        <w:t>restart</w:t>
+      </w:r>
+      <w:r>
+        <w:rPr>
+          <w:lang w:val="ru-RU"/>
+        </w:rPr>
+        <w:t xml:space="preserve"> </w:t>
+      </w:r>
+      <w:r>
+        <w:t>policy</w:t>
+      </w:r>
+      <w:r>
+        <w:rPr>
+          <w:lang w:val="ru-RU"/>
+        </w:rPr>
+        <w:t xml:space="preserve">, </w:t>
+      </w:r>
+      <w:proofErr w:type="spellStart"/>
+      <w:r>
+        <w:t>healthcheck</w:t>
+      </w:r>
+      <w:proofErr w:type="spellEnd"/>
+      <w:r>
+        <w:rPr>
+          <w:lang w:val="ru-RU"/>
+        </w:rPr>
+        <w:t>). То, что заняло бы недели освоения — делается за часы объяснений.</w:t>
+      </w:r>
+    </w:p>
+    <w:p>
+      <w:pPr>
+        <w:spacing w:after="120"/>
+        <w:rPr>
+          <w:lang w:val="ru-RU"/>
+        </w:rPr>
+      </w:pPr>
+      <w:r>
+        <w:rPr>
+          <w:lang w:val="ru-RU"/>
+        </w:rPr>
+        <w:t>*</w:t>
+      </w:r>
+      <w:proofErr w:type="gramStart"/>
+      <w:r>
+        <w:rPr>
+          <w:lang w:val="ru-RU"/>
+        </w:rPr>
+        <w:t>Докумен</w:t>
+      </w:r>
+      <w:r>
+        <w:rPr>
+          <w:lang w:val="ru-RU"/>
+        </w:rPr>
+        <w:t>тация.*</w:t>
+      </w:r>
+      <w:proofErr w:type="gramEnd"/>
+      <w:r>
+        <w:rPr>
+          <w:lang w:val="ru-RU"/>
+        </w:rPr>
+        <w:t xml:space="preserve"> </w:t>
+      </w:r>
+      <w:r>
+        <w:t>ADR</w:t>
+      </w:r>
+      <w:r>
+        <w:rPr>
+          <w:lang w:val="ru-RU"/>
+        </w:rPr>
+        <w:t xml:space="preserve"> (</w:t>
+      </w:r>
+      <w:r>
+        <w:t>Architecture</w:t>
+      </w:r>
+      <w:r>
+        <w:rPr>
+          <w:lang w:val="ru-RU"/>
+        </w:rPr>
+        <w:t xml:space="preserve"> </w:t>
+      </w:r>
+      <w:r>
+        <w:t>Decision</w:t>
+      </w:r>
+      <w:r>
+        <w:rPr>
+          <w:lang w:val="ru-RU"/>
+        </w:rPr>
+        <w:t xml:space="preserve"> </w:t>
+      </w:r>
+      <w:r>
+        <w:t>Records</w:t>
+      </w:r>
+      <w:r>
+        <w:rPr>
+          <w:lang w:val="ru-RU"/>
+        </w:rPr>
+        <w:t xml:space="preserve">), </w:t>
+      </w:r>
+      <w:r>
+        <w:t>CHANGELOG</w:t>
+      </w:r>
+      <w:r>
+        <w:rPr>
+          <w:lang w:val="ru-RU"/>
+        </w:rPr>
+        <w:t>, двуязычные инструкции — создаются вместе с реализацией. Решения зафиксированы с обоснованием, а не теряются в голове.</w:t>
+      </w:r>
+    </w:p>
+    <w:p>
+      <w:pPr>
+        <w:spacing w:after="120"/>
+        <w:rPr>
+          <w:lang w:val="ru-RU"/>
+        </w:rPr>
+      </w:pPr>
+      <w:r>
+        <w:rPr>
+          <w:lang w:val="ru-RU"/>
+        </w:rPr>
+        <w:t>*</w:t>
+      </w:r>
+      <w:proofErr w:type="gramStart"/>
+      <w:r>
+        <w:rPr>
+          <w:lang w:val="ru-RU"/>
+        </w:rPr>
+        <w:t>Системность.*</w:t>
+      </w:r>
+      <w:proofErr w:type="gramEnd"/>
+      <w:r>
+        <w:rPr>
+          <w:lang w:val="ru-RU"/>
+        </w:rPr>
+        <w:t xml:space="preserve"> </w:t>
+      </w:r>
+      <w:r>
+        <w:t>CI</w:t>
+      </w:r>
+      <w:r>
+        <w:rPr>
+          <w:lang w:val="ru-RU"/>
+        </w:rPr>
+        <w:t>/</w:t>
+      </w:r>
+      <w:r>
+        <w:t>CD</w:t>
+      </w:r>
+      <w:r>
+        <w:rPr>
+          <w:lang w:val="ru-RU"/>
+        </w:rPr>
+        <w:t xml:space="preserve"> в </w:t>
+      </w:r>
+      <w:r>
+        <w:t>GitHub</w:t>
+      </w:r>
+      <w:r>
+        <w:rPr>
+          <w:lang w:val="ru-RU"/>
+        </w:rPr>
+        <w:t xml:space="preserve"> </w:t>
+      </w:r>
+      <w:r>
+        <w:t>Actions</w:t>
+      </w:r>
+      <w:r>
+        <w:rPr>
+          <w:lang w:val="ru-RU"/>
+        </w:rPr>
+        <w:t xml:space="preserve">, </w:t>
+      </w:r>
+      <w:r>
+        <w:t>secrets</w:t>
+      </w:r>
+      <w:r>
+        <w:rPr>
+          <w:lang w:val="ru-RU"/>
+        </w:rPr>
+        <w:t>-</w:t>
+      </w:r>
+      <w:r>
+        <w:t>check</w:t>
+      </w:r>
+      <w:r>
+        <w:rPr>
+          <w:lang w:val="ru-RU"/>
+        </w:rPr>
+        <w:t xml:space="preserve"> перед каждым </w:t>
+      </w:r>
+      <w:r>
+        <w:t>push</w:t>
+      </w:r>
+      <w:r>
+        <w:rPr>
+          <w:lang w:val="ru-RU"/>
+        </w:rPr>
+        <w:t xml:space="preserve">, </w:t>
+      </w:r>
+      <w:proofErr w:type="spellStart"/>
+      <w:r>
+        <w:t>shellcheck</w:t>
+      </w:r>
+      <w:proofErr w:type="spellEnd"/>
+      <w:r>
+        <w:rPr>
+          <w:lang w:val="ru-RU"/>
+        </w:rPr>
+        <w:t xml:space="preserve"> для </w:t>
+      </w:r>
+      <w:r>
+        <w:t>bash</w:t>
+      </w:r>
+      <w:r>
+        <w:rPr>
+          <w:lang w:val="ru-RU"/>
+        </w:rPr>
+        <w:t xml:space="preserve">-скриптов, </w:t>
+      </w:r>
+      <w:proofErr w:type="spellStart"/>
+      <w:r>
+        <w:t>goss</w:t>
+      </w:r>
+      <w:proofErr w:type="spellEnd"/>
+      <w:r>
+        <w:rPr>
+          <w:lang w:val="ru-RU"/>
+        </w:rPr>
+        <w:t xml:space="preserve">-тесты — агент знает </w:t>
+      </w:r>
+      <w:r>
+        <w:t>open</w:t>
+      </w:r>
+      <w:r>
+        <w:rPr>
+          <w:lang w:val="ru-RU"/>
+        </w:rPr>
+        <w:t>-</w:t>
+      </w:r>
+      <w:r>
+        <w:t>source</w:t>
+      </w:r>
+      <w:r>
+        <w:rPr>
+          <w:lang w:val="ru-RU"/>
+        </w:rPr>
+        <w:t xml:space="preserve"> конвенции и применяет их автоматически.</w:t>
+      </w:r>
+    </w:p>
+    <w:p>
+      <w:pPr>
+        <w:spacing w:after="120"/>
+        <w:rPr>
+          <w:lang w:val="ru-RU"/>
+        </w:rPr>
+      </w:pPr>
+      <w:r>
+        <w:rPr>
+          <w:b/>
+          <w:lang w:val="ru-RU"/>
+        </w:rPr>
+        <w:t>Что требует контроля человека:</w:t>
+      </w:r>
+    </w:p>
+    <w:p>
+      <w:pPr>
+        <w:spacing w:after="120"/>
+        <w:rPr>
+          <w:lang w:val="ru-RU"/>
+        </w:rPr>
+      </w:pPr>
+      <w:r>
+        <w:rPr>
+          <w:lang w:val="ru-RU"/>
+        </w:rPr>
+        <w:t xml:space="preserve">Агент не знает ваше железо. Нужно объяснять детали: какой чип в </w:t>
+      </w:r>
+      <w:r>
+        <w:t>USB</w:t>
+      </w:r>
+      <w:r>
+        <w:rPr>
+          <w:lang w:val="ru-RU"/>
+        </w:rPr>
+        <w:t xml:space="preserve">-мосте, реальное </w:t>
+      </w:r>
+      <w:r>
+        <w:t>RAM</w:t>
+      </w:r>
+      <w:r>
+        <w:rPr>
+          <w:lang w:val="ru-RU"/>
+        </w:rPr>
+        <w:t xml:space="preserve">, версию </w:t>
+      </w:r>
+      <w:r>
+        <w:t>kernel</w:t>
+      </w:r>
+      <w:r>
+        <w:rPr>
+          <w:lang w:val="ru-RU"/>
+        </w:rPr>
+        <w:t xml:space="preserve">, что на </w:t>
+      </w:r>
+      <w:r>
+        <w:t>VPS</w:t>
+      </w:r>
+      <w:r>
+        <w:rPr>
+          <w:lang w:val="ru-RU"/>
+        </w:rPr>
+        <w:t xml:space="preserve"> нельзя трогат</w:t>
+      </w:r>
+      <w:r>
+        <w:rPr>
+          <w:lang w:val="ru-RU"/>
+        </w:rPr>
+        <w:t>ь. Без этого контекста рекомендации будут общими.</w:t>
+      </w:r>
+    </w:p>
+    <w:p>
+      <w:pPr>
+        <w:spacing w:after="120"/>
+        <w:rPr>
+          <w:lang w:val="ru-RU"/>
+        </w:rPr>
+      </w:pPr>
+      <w:r>
+        <w:t>Firewall</w:t>
+      </w:r>
+      <w:r>
+        <w:rPr>
+          <w:lang w:val="ru-RU"/>
+        </w:rPr>
+        <w:t xml:space="preserve">, </w:t>
+      </w:r>
+      <w:proofErr w:type="spellStart"/>
+      <w:r>
+        <w:t>fstab</w:t>
+      </w:r>
+      <w:proofErr w:type="spellEnd"/>
+      <w:r>
+        <w:rPr>
+          <w:lang w:val="ru-RU"/>
+        </w:rPr>
+        <w:t>, пароли — проверять самому. Агент напишет конфиг, но финальная ответственность за безопасность — ваша.</w:t>
+      </w:r>
+    </w:p>
+    <w:p>
+      <w:pPr>
+        <w:spacing w:after="120"/>
+        <w:rPr>
+          <w:lang w:val="ru-RU"/>
+        </w:rPr>
+      </w:pPr>
+      <w:r>
+        <w:rPr>
+          <w:lang w:val="ru-RU"/>
+        </w:rPr>
+        <w:t xml:space="preserve">Контекст сессии конечен. Решается </w:t>
+      </w:r>
+      <w:r>
+        <w:rPr>
+          <w:rFonts w:ascii="Courier New" w:hAnsi="Courier New"/>
           <w:sz w:val="20"/>
-          <w:lang w:val="ru-RU"/>
-        </w:rPr>
-        <w:t xml:space="preserve">[Скриншот: </w:t>
+        </w:rPr>
+        <w:t>AGENTS</w:t>
+      </w:r>
+      <w:r>
+        <w:rPr>
+          <w:rFonts w:ascii="Courier New" w:hAnsi="Courier New"/>
+          <w:sz w:val="20"/>
+          <w:lang w:val="ru-RU"/>
+        </w:rPr>
+        <w:t>.</w:t>
+      </w:r>
+      <w:r>
+        <w:rPr>
+          <w:rFonts w:ascii="Courier New" w:hAnsi="Courier New"/>
+          <w:sz w:val="20"/>
+        </w:rPr>
+        <w:t>md</w:t>
+      </w:r>
+      <w:r>
+        <w:rPr>
+          <w:lang w:val="ru-RU"/>
+        </w:rPr>
+        <w:t xml:space="preserve"> и </w:t>
+      </w:r>
+      <w:r>
+        <w:rPr>
+          <w:rFonts w:ascii="Courier New" w:hAnsi="Courier New"/>
+          <w:sz w:val="20"/>
+        </w:rPr>
+        <w:t>CLAUDE</w:t>
+      </w:r>
+      <w:r>
+        <w:rPr>
+          <w:rFonts w:ascii="Courier New" w:hAnsi="Courier New"/>
+          <w:sz w:val="20"/>
+          <w:lang w:val="ru-RU"/>
+        </w:rPr>
+        <w:t>.</w:t>
+      </w:r>
+      <w:r>
+        <w:rPr>
+          <w:rFonts w:ascii="Courier New" w:hAnsi="Courier New"/>
+          <w:sz w:val="20"/>
+        </w:rPr>
+        <w:t>md</w:t>
+      </w:r>
+      <w:r>
+        <w:rPr>
+          <w:lang w:val="ru-RU"/>
+        </w:rPr>
+        <w:t xml:space="preserve"> — файлы, которые агент читает п</w:t>
+      </w:r>
+      <w:r>
+        <w:rPr>
+          <w:lang w:val="ru-RU"/>
+        </w:rPr>
+        <w:t>ри старте. Там зафиксировано актуальное состояние системы, жёсткие запреты и архитектурные решения.</w:t>
+      </w:r>
+    </w:p>
+    <w:p>
+      <w:pPr>
+        <w:spacing w:after="120"/>
+        <w:rPr>
+          <w:lang w:val="ru-RU"/>
+        </w:rPr>
+      </w:pPr>
+      <w:r>
+        <w:rPr>
+          <w:b/>
+          <w:lang w:val="ru-RU"/>
+        </w:rPr>
+        <w:t>Открытые вопросы (честно):</w:t>
+      </w:r>
+    </w:p>
+    <w:p>
+      <w:pPr>
+        <w:spacing w:after="120"/>
+        <w:rPr>
+          <w:lang w:val="ru-RU"/>
+        </w:rPr>
+      </w:pPr>
+      <w:r>
+        <w:rPr>
+          <w:lang w:val="ru-RU"/>
+        </w:rPr>
+        <w:t xml:space="preserve">- </w:t>
+      </w:r>
+      <w:r>
+        <w:t>Docker</w:t>
+      </w:r>
+      <w:r>
+        <w:rPr>
+          <w:lang w:val="ru-RU"/>
+        </w:rPr>
+        <w:t xml:space="preserve"> 20.10.7 устарел — обновить нетривиально на </w:t>
       </w:r>
       <w:proofErr w:type="spellStart"/>
       <w:r>
-        <w:rPr>
-          <w:i/>
-          <w:color w:val="888888"/>
-          <w:sz w:val="20"/>
-        </w:rPr>
+        <w:t>JetPack</w:t>
+      </w:r>
+      <w:proofErr w:type="spellEnd"/>
+    </w:p>
+    <w:p>
+      <w:pPr>
+        <w:spacing w:after="120"/>
+        <w:rPr>
+          <w:lang w:val="ru-RU"/>
+        </w:rPr>
+      </w:pPr>
+      <w:r>
+        <w:rPr>
+          <w:lang w:val="ru-RU"/>
+        </w:rPr>
+        <w:t xml:space="preserve">- </w:t>
+      </w:r>
+      <w:r>
+        <w:t>off</w:t>
+      </w:r>
+      <w:r>
+        <w:rPr>
+          <w:lang w:val="ru-RU"/>
+        </w:rPr>
+        <w:t>-</w:t>
+      </w:r>
+      <w:r>
+        <w:t>site</w:t>
+      </w:r>
+      <w:r>
+        <w:rPr>
+          <w:lang w:val="ru-RU"/>
+        </w:rPr>
+        <w:t xml:space="preserve"> </w:t>
+      </w:r>
+      <w:r>
+        <w:t>backup</w:t>
+      </w:r>
+      <w:r>
+        <w:rPr>
+          <w:lang w:val="ru-RU"/>
+        </w:rPr>
+        <w:t xml:space="preserve"> не настроен — </w:t>
+      </w:r>
+      <w:proofErr w:type="spellStart"/>
+      <w:r>
+        <w:t>restic</w:t>
+      </w:r>
+      <w:proofErr w:type="spellEnd"/>
+      <w:r>
+        <w:rPr>
+          <w:lang w:val="ru-RU"/>
+        </w:rPr>
+        <w:t xml:space="preserve"> скрипты готовы, </w:t>
+      </w:r>
+      <w:r>
+        <w:t>backup</w:t>
+      </w:r>
+      <w:r>
+        <w:rPr>
+          <w:lang w:val="ru-RU"/>
+        </w:rPr>
+        <w:t xml:space="preserve"> на </w:t>
+      </w:r>
+      <w:r>
+        <w:t>VPS</w:t>
+      </w:r>
+      <w:r>
+        <w:rPr>
+          <w:lang w:val="ru-RU"/>
+        </w:rPr>
+        <w:t xml:space="preserve"> </w:t>
+      </w:r>
+      <w:r>
+        <w:rPr>
+          <w:lang w:val="ru-RU"/>
+        </w:rPr>
+        <w:t>не запущен</w:t>
+      </w:r>
+    </w:p>
+    <w:p>
+      <w:pPr>
+        <w:spacing w:after="120"/>
+        <w:rPr>
+          <w:lang w:val="ru-RU"/>
+        </w:rPr>
+      </w:pPr>
+      <w:r>
+        <w:rPr>
+          <w:lang w:val="ru-RU"/>
+        </w:rPr>
+        <w:t xml:space="preserve">- </w:t>
+      </w:r>
+      <w:r>
+        <w:t>ML</w:t>
+      </w:r>
+      <w:r>
+        <w:rPr>
+          <w:lang w:val="ru-RU"/>
+        </w:rPr>
+        <w:t xml:space="preserve"> в </w:t>
+      </w:r>
+      <w:proofErr w:type="spellStart"/>
+      <w:r>
         <w:t>Immich</w:t>
       </w:r>
       <w:proofErr w:type="spellEnd"/>
       <w:r>
         <w:rPr>
-          <w:i/>
-          <w:color w:val="888888"/>
-          <w:sz w:val="20"/>
-          <w:lang w:val="ru-RU"/>
-        </w:rPr>
-        <w:t xml:space="preserve"> — фотоархив семьи (6.1 </w:t>
-      </w:r>
-      <w:r>
-        <w:rPr>
-          <w:i/>
-          <w:color w:val="888888"/>
-          <w:sz w:val="20"/>
-        </w:rPr>
-        <w:t>GiB</w:t>
-      </w:r>
-      <w:r>
-        <w:rPr>
-          <w:i/>
-          <w:color w:val="888888"/>
-          <w:sz w:val="20"/>
-          <w:lang w:val="ru-RU"/>
-        </w:rPr>
-        <w:t xml:space="preserve">, 228 </w:t>
-      </w:r>
-      <w:r>
-        <w:rPr>
-          <w:i/>
-          <w:color w:val="888888"/>
-          <w:sz w:val="20"/>
-        </w:rPr>
+          <w:lang w:val="ru-RU"/>
+        </w:rPr>
+        <w:t xml:space="preserve"> отключён — </w:t>
+      </w:r>
+      <w:r>
+        <w:t>Jetson</w:t>
+      </w:r>
+      <w:r>
+        <w:rPr>
+          <w:lang w:val="ru-RU"/>
+        </w:rPr>
+        <w:t xml:space="preserve"> 4 </w:t>
+      </w:r>
+      <w:r>
         <w:t>GB</w:t>
       </w:r>
       <w:r>
         <w:rPr>
-          <w:i/>
-          <w:color w:val="888888"/>
-          <w:sz w:val="20"/>
-          <w:lang w:val="ru-RU"/>
-        </w:rPr>
-        <w:t xml:space="preserve"> свободно)]</w:t>
+          <w:lang w:val="ru-RU"/>
+        </w:rPr>
+        <w:t xml:space="preserve"> без </w:t>
+      </w:r>
+      <w:r>
+        <w:t>swap</w:t>
+      </w:r>
+      <w:r>
+        <w:rPr>
+          <w:lang w:val="ru-RU"/>
+        </w:rPr>
+        <w:t xml:space="preserve"> не тянет распознавание лиц</w:t>
       </w:r>
     </w:p>
     <w:p>
@@ -7399,229 +8354,41 @@
       </w:pPr>
       <w:r>
         <w:rPr>
-          <w:b/>
-          <w:lang w:val="ru-RU"/>
-        </w:rPr>
-        <w:t>Цифры по итогу:</w:t>
-      </w:r>
-    </w:p>
-    <w:p>
-      <w:pPr>
-        <w:spacing w:after="120"/>
-        <w:rPr>
-          <w:lang w:val="ru-RU"/>
-        </w:rPr>
-      </w:pPr>
-      <w:r>
-        <w:rPr>
-          <w:lang w:val="ru-RU"/>
-        </w:rPr>
-        <w:t xml:space="preserve">- 13 </w:t>
-      </w:r>
-      <w:r>
-        <w:t>Dock</w:t>
-      </w:r>
-      <w:r>
-        <w:t>er</w:t>
-      </w:r>
-      <w:r>
-        <w:rPr>
-          <w:lang w:val="ru-RU"/>
-        </w:rPr>
-        <w:t xml:space="preserve">-контейнеров, все </w:t>
-      </w:r>
-      <w:r>
-        <w:rPr>
-          <w:rFonts w:ascii="Courier New" w:hAnsi="Courier New"/>
-          <w:sz w:val="20"/>
-        </w:rPr>
-        <w:t>up</w:t>
-      </w:r>
-      <w:r>
-        <w:rPr>
-          <w:rFonts w:ascii="Courier New" w:hAnsi="Courier New"/>
-          <w:sz w:val="20"/>
-          <w:lang w:val="ru-RU"/>
-        </w:rPr>
-        <w:t>/</w:t>
-      </w:r>
-      <w:r>
-        <w:rPr>
-          <w:rFonts w:ascii="Courier New" w:hAnsi="Courier New"/>
-          <w:sz w:val="20"/>
-        </w:rPr>
-        <w:t>healthy</w:t>
-      </w:r>
-    </w:p>
-    <w:p>
-      <w:pPr>
-        <w:spacing w:after="120"/>
-        <w:rPr>
-          <w:lang w:val="ru-RU"/>
-        </w:rPr>
-      </w:pPr>
-      <w:r>
-        <w:rPr>
-          <w:lang w:val="ru-RU"/>
-        </w:rPr>
-        <w:t>- 6 697 фотографий и видео загружено с телефона</w:t>
-      </w:r>
-    </w:p>
-    <w:p>
-      <w:pPr>
-        <w:spacing w:after="120"/>
-        <w:rPr>
-          <w:lang w:val="ru-RU"/>
-        </w:rPr>
-      </w:pPr>
-      <w:r>
-        <w:rPr>
-          <w:lang w:val="ru-RU"/>
-        </w:rPr>
-        <w:t>- 2 151 контакт синхронизируется</w:t>
-      </w:r>
-    </w:p>
-    <w:p>
-      <w:pPr>
-        <w:spacing w:after="120"/>
-        <w:rPr>
-          <w:lang w:val="ru-RU"/>
-        </w:rPr>
-      </w:pPr>
-      <w:r>
-        <w:rPr>
-          <w:lang w:val="ru-RU"/>
-        </w:rPr>
-        <w:t>- 5 членов семьи в чате</w:t>
-      </w:r>
-    </w:p>
-    <w:p>
-      <w:pPr>
-        <w:spacing w:after="120"/>
-        <w:rPr>
-          <w:lang w:val="ru-RU"/>
-        </w:rPr>
-      </w:pPr>
-      <w:r>
-        <w:rPr>
           <w:lang w:val="ru-RU"/>
         </w:rPr>
         <w:t xml:space="preserve">- </w:t>
       </w:r>
+      <w:r>
+        <w:t>SMART</w:t>
+      </w:r>
+      <w:r>
+        <w:rPr>
+          <w:lang w:val="ru-RU"/>
+        </w:rPr>
+        <w:t xml:space="preserve"> у </w:t>
+      </w:r>
+      <w:r>
+        <w:t>JMS</w:t>
+      </w:r>
+      <w:r>
+        <w:rPr>
+          <w:lang w:val="ru-RU"/>
+        </w:rPr>
+        <w:t xml:space="preserve">583 базовый — </w:t>
+      </w:r>
       <w:proofErr w:type="spellStart"/>
       <w:r>
-        <w:t>goss</w:t>
+        <w:t>smartmontools</w:t>
       </w:r>
       <w:proofErr w:type="spellEnd"/>
       <w:r>
         <w:rPr>
           <w:lang w:val="ru-RU"/>
         </w:rPr>
-        <w:t xml:space="preserve"> 40/40 — инфраструктурные тесты</w:t>
-      </w:r>
-    </w:p>
-    <w:p>
-      <w:pPr>
-        <w:spacing w:after="120"/>
-        <w:rPr>
-          <w:lang w:val="ru-RU"/>
-        </w:rPr>
-      </w:pPr>
-      <w:r>
-        <w:rPr>
-          <w:lang w:val="ru-RU"/>
-        </w:rPr>
-        <w:t xml:space="preserve">- </w:t>
-      </w:r>
-      <w:r>
-        <w:t>Write</w:t>
-      </w:r>
-      <w:r>
-        <w:rPr>
-          <w:lang w:val="ru-RU"/>
-        </w:rPr>
-        <w:t xml:space="preserve"> 250 </w:t>
-      </w:r>
-      <w:r>
-        <w:t>MB</w:t>
-      </w:r>
-      <w:r>
-        <w:rPr>
-          <w:lang w:val="ru-RU"/>
-        </w:rPr>
-        <w:t>/</w:t>
-      </w:r>
-      <w:r>
-        <w:t>s</w:t>
-      </w:r>
-      <w:r>
-        <w:rPr>
-          <w:lang w:val="ru-RU"/>
-        </w:rPr>
-        <w:t xml:space="preserve">, </w:t>
-      </w:r>
-      <w:r>
-        <w:t>Read</w:t>
-      </w:r>
-      <w:r>
-        <w:rPr>
-          <w:lang w:val="ru-RU"/>
-        </w:rPr>
-        <w:t xml:space="preserve"> 172 </w:t>
-      </w:r>
-      <w:r>
-        <w:t>MB</w:t>
-      </w:r>
-      <w:r>
-        <w:rPr>
-          <w:lang w:val="ru-RU"/>
-        </w:rPr>
-        <w:t>/</w:t>
-      </w:r>
-      <w:r>
-        <w:t>s</w:t>
-      </w:r>
-      <w:r>
-        <w:rPr>
-          <w:lang w:val="ru-RU"/>
-        </w:rPr>
-        <w:t xml:space="preserve"> на </w:t>
-      </w:r>
-      <w:r>
-        <w:t>SSD</w:t>
-      </w:r>
-    </w:p>
-    <w:p>
-      <w:pPr>
-        <w:spacing w:after="120"/>
-        <w:rPr>
-          <w:lang w:val="ru-RU"/>
-        </w:rPr>
-      </w:pPr>
-      <w:r>
-        <w:rPr>
-          <w:b/>
-          <w:lang w:val="ru-RU"/>
-        </w:rPr>
-        <w:t>Что заменили:</w:t>
-      </w:r>
-    </w:p>
-    <w:p>
-      <w:pPr>
-        <w:spacing w:after="120"/>
-        <w:rPr>
-          <w:lang w:val="ru-RU"/>
-        </w:rPr>
-      </w:pPr>
-      <w:r>
-        <w:rPr>
-          <w:lang w:val="ru-RU"/>
-        </w:rPr>
-        <w:lastRenderedPageBreak/>
-        <w:t xml:space="preserve">- </w:t>
-      </w:r>
-      <w:r>
-        <w:t>Google</w:t>
+        <w:t xml:space="preserve"> 6.6 не поддерживает полный </w:t>
+      </w:r>
+      <w:r>
+        <w:t>SAT</w:t>
       </w:r>
       <w:r>
         <w:rPr>
@@ -7630,111 +8397,7 @@
         <w:t xml:space="preserve"> </w:t>
       </w:r>
       <w:r>
-        <w:t>Photos</w:t>
-      </w:r>
-      <w:r>
-        <w:rPr>
-          <w:lang w:val="ru-RU"/>
-        </w:rPr>
-        <w:t xml:space="preserve"> → </w:t>
-      </w:r>
-      <w:proofErr w:type="spellStart"/>
-      <w:r>
-        <w:t>Immich</w:t>
-      </w:r>
-      <w:proofErr w:type="spellEnd"/>
-      <w:r>
-        <w:rPr>
-          <w:lang w:val="ru-RU"/>
-        </w:rPr>
-        <w:t xml:space="preserve"> (</w:t>
-      </w:r>
-      <w:proofErr w:type="spellStart"/>
-      <w:r>
-        <w:rPr>
-          <w:lang w:val="ru-RU"/>
-        </w:rPr>
-        <w:t>автобэкап</w:t>
-      </w:r>
-      <w:proofErr w:type="spellEnd"/>
-      <w:r>
-        <w:rPr>
-          <w:lang w:val="ru-RU"/>
-        </w:rPr>
-        <w:t>, поиск, альбомы)</w:t>
-      </w:r>
-    </w:p>
-    <w:p>
-      <w:pPr>
-        <w:spacing w:after="120"/>
-        <w:rPr>
-          <w:lang w:val="ru-RU"/>
-        </w:rPr>
-      </w:pPr>
-      <w:r>
-        <w:rPr>
-          <w:lang w:val="ru-RU"/>
-        </w:rPr>
-        <w:t xml:space="preserve">- </w:t>
-      </w:r>
-      <w:r>
-        <w:t>Google</w:t>
-      </w:r>
-      <w:r>
-        <w:rPr>
-          <w:lang w:val="ru-RU"/>
-        </w:rPr>
-        <w:t xml:space="preserve"> </w:t>
-      </w:r>
-      <w:r>
-        <w:t>Drive</w:t>
-      </w:r>
-      <w:r>
-        <w:rPr>
-          <w:lang w:val="ru-RU"/>
-        </w:rPr>
-        <w:t xml:space="preserve"> / </w:t>
-      </w:r>
-      <w:proofErr w:type="spellStart"/>
-      <w:r>
-        <w:rPr>
-          <w:lang w:val="ru-RU"/>
-        </w:rPr>
-        <w:t>Яндекс.Диск</w:t>
-      </w:r>
-      <w:proofErr w:type="spellEnd"/>
-      <w:r>
-        <w:rPr>
-          <w:lang w:val="ru-RU"/>
-        </w:rPr>
-        <w:t xml:space="preserve"> → </w:t>
-      </w:r>
-      <w:proofErr w:type="spellStart"/>
-      <w:r>
-        <w:t>Nextcloud</w:t>
-      </w:r>
-      <w:proofErr w:type="spellEnd"/>
-      <w:r>
-        <w:rPr>
-          <w:lang w:val="ru-RU"/>
-        </w:rPr>
-        <w:t xml:space="preserve"> (файлы, синхронизация)</w:t>
-      </w:r>
-    </w:p>
-    <w:p>
-      <w:pPr>
-        <w:spacing w:after="120"/>
-      </w:pPr>
-      <w:r>
-        <w:t>- Google Contacts → DAVx⁵ + Nextcloud (CardDAV)</w:t>
-      </w:r>
-    </w:p>
-    <w:p>
-      <w:pPr>
-        <w:spacing w:after="120"/>
-      </w:pPr>
-      <w:r>
-        <w:t>- WhatsApp/Telegram-группы → Nextcloud Talk (история на своём SSD)</w:t>
+        <w:t>passthrough</w:t>
       </w:r>
     </w:p>
     <w:p>
@@ -7742,6 +8405,9 @@
         <w:pBdr>
           <w:bottom w:val="single" w:sz="6" w:space="1" w:color="CCCCCC"/>
         </w:pBdr>
+        <w:rPr>
+          <w:lang w:val="ru-RU"/>
+        </w:rPr>
       </w:pPr>
     </w:p>
     <w:p>
@@ -7757,839 +8423,6 @@
           <w:sz w:val="30"/>
           <w:lang w:val="ru-RU"/>
         </w:rPr>
-        <w:t xml:space="preserve">Честная оценка </w:t>
-      </w:r>
-      <w:r>
-        <w:rPr>
-          <w:color w:val="16213E"/>
-          <w:sz w:val="30"/>
-        </w:rPr>
-        <w:t>AI</w:t>
-      </w:r>
-      <w:r>
-        <w:rPr>
-          <w:color w:val="16213E"/>
-          <w:sz w:val="30"/>
-          <w:lang w:val="ru-RU"/>
-        </w:rPr>
-        <w:t>-</w:t>
-      </w:r>
-      <w:r>
-        <w:rPr>
-          <w:color w:val="16213E"/>
-          <w:sz w:val="30"/>
-        </w:rPr>
-        <w:t>assisted</w:t>
-      </w:r>
-      <w:r>
-        <w:rPr>
-          <w:color w:val="16213E"/>
-          <w:sz w:val="30"/>
-          <w:lang w:val="ru-RU"/>
-        </w:rPr>
-        <w:t xml:space="preserve"> подхода</w:t>
-      </w:r>
-    </w:p>
-    <w:p>
-      <w:pPr>
-        <w:spacing w:after="120"/>
-        <w:rPr>
-          <w:lang w:val="ru-RU"/>
-        </w:rPr>
-      </w:pPr>
-      <w:r>
-        <w:rPr>
-          <w:b/>
-          <w:lang w:val="ru-RU"/>
-        </w:rPr>
-        <w:t>Что по</w:t>
-      </w:r>
-      <w:r>
-        <w:rPr>
-          <w:b/>
-          <w:lang w:val="ru-RU"/>
-        </w:rPr>
-        <w:t>лучилось хорошо:</w:t>
-      </w:r>
-    </w:p>
-    <w:p>
-      <w:pPr>
-        <w:spacing w:after="120"/>
-        <w:rPr>
-          <w:lang w:val="ru-RU"/>
-        </w:rPr>
-      </w:pPr>
-      <w:r>
-        <w:rPr>
-          <w:lang w:val="ru-RU"/>
-        </w:rPr>
-        <w:t>*</w:t>
-      </w:r>
-      <w:proofErr w:type="gramStart"/>
-      <w:r>
-        <w:rPr>
-          <w:lang w:val="ru-RU"/>
-        </w:rPr>
-        <w:t>Скорость.*</w:t>
-      </w:r>
-      <w:proofErr w:type="gramEnd"/>
-      <w:r>
-        <w:rPr>
-          <w:lang w:val="ru-RU"/>
-        </w:rPr>
-        <w:t xml:space="preserve"> </w:t>
-      </w:r>
-      <w:proofErr w:type="spellStart"/>
-      <w:r>
-        <w:t>systemd</w:t>
-      </w:r>
-      <w:proofErr w:type="spellEnd"/>
-      <w:r>
-        <w:rPr>
-          <w:lang w:val="ru-RU"/>
-        </w:rPr>
-        <w:t xml:space="preserve">-юниты, </w:t>
-      </w:r>
-      <w:proofErr w:type="spellStart"/>
-      <w:r>
-        <w:t>udev</w:t>
-      </w:r>
-      <w:proofErr w:type="spellEnd"/>
-      <w:r>
-        <w:rPr>
-          <w:lang w:val="ru-RU"/>
-        </w:rPr>
-        <w:t xml:space="preserve">-правила, </w:t>
-      </w:r>
-      <w:proofErr w:type="spellStart"/>
-      <w:r>
-        <w:t>nginx</w:t>
-      </w:r>
-      <w:proofErr w:type="spellEnd"/>
-      <w:r>
-        <w:rPr>
-          <w:lang w:val="ru-RU"/>
-        </w:rPr>
-        <w:t xml:space="preserve">-конфиги, </w:t>
-      </w:r>
-      <w:r>
-        <w:t>Docker</w:t>
-      </w:r>
-      <w:r>
-        <w:rPr>
-          <w:lang w:val="ru-RU"/>
-        </w:rPr>
-        <w:t xml:space="preserve"> </w:t>
-      </w:r>
-      <w:r>
-        <w:t>Compose</w:t>
-      </w:r>
-      <w:r>
-        <w:rPr>
-          <w:lang w:val="ru-RU"/>
-        </w:rPr>
-        <w:t xml:space="preserve"> — агент пишет это параллельно, не забывая про детали (</w:t>
-      </w:r>
-      <w:r>
-        <w:t>mem</w:t>
-      </w:r>
-      <w:r>
-        <w:rPr>
-          <w:lang w:val="ru-RU"/>
-        </w:rPr>
-        <w:t>_</w:t>
-      </w:r>
-      <w:r>
-        <w:t>limit</w:t>
-      </w:r>
-      <w:r>
-        <w:rPr>
-          <w:lang w:val="ru-RU"/>
-        </w:rPr>
-        <w:t xml:space="preserve">, </w:t>
-      </w:r>
-      <w:r>
-        <w:t>restart</w:t>
-      </w:r>
-      <w:r>
-        <w:rPr>
-          <w:lang w:val="ru-RU"/>
-        </w:rPr>
-        <w:t xml:space="preserve"> </w:t>
-      </w:r>
-      <w:r>
-        <w:t>policy</w:t>
-      </w:r>
-      <w:r>
-        <w:rPr>
-          <w:lang w:val="ru-RU"/>
-        </w:rPr>
-        <w:t xml:space="preserve">, </w:t>
-      </w:r>
-      <w:proofErr w:type="spellStart"/>
-      <w:r>
-        <w:t>healthcheck</w:t>
-      </w:r>
-      <w:proofErr w:type="spellEnd"/>
-      <w:r>
-        <w:rPr>
-          <w:lang w:val="ru-RU"/>
-        </w:rPr>
-        <w:t>). То, что заняло бы недели освоения — делается за часы объяснений.</w:t>
-      </w:r>
-    </w:p>
-    <w:p>
-      <w:pPr>
-        <w:spacing w:after="120"/>
-        <w:rPr>
-          <w:lang w:val="ru-RU"/>
-        </w:rPr>
-      </w:pPr>
-      <w:r>
-        <w:rPr>
-          <w:lang w:val="ru-RU"/>
-        </w:rPr>
-        <w:t>*</w:t>
-      </w:r>
-      <w:proofErr w:type="gramStart"/>
-      <w:r>
-        <w:rPr>
-          <w:lang w:val="ru-RU"/>
-        </w:rPr>
-        <w:t>Докумен</w:t>
-      </w:r>
-      <w:r>
-        <w:rPr>
-          <w:lang w:val="ru-RU"/>
-        </w:rPr>
-        <w:t>тация.*</w:t>
-      </w:r>
-      <w:proofErr w:type="gramEnd"/>
-      <w:r>
-        <w:rPr>
-          <w:lang w:val="ru-RU"/>
-        </w:rPr>
-        <w:t xml:space="preserve"> </w:t>
-      </w:r>
-      <w:r>
-        <w:t>ADR</w:t>
-      </w:r>
-      <w:r>
-        <w:rPr>
-          <w:lang w:val="ru-RU"/>
-        </w:rPr>
-        <w:t xml:space="preserve"> (</w:t>
-      </w:r>
-      <w:r>
-        <w:t>Architecture</w:t>
-      </w:r>
-      <w:r>
-        <w:rPr>
-          <w:lang w:val="ru-RU"/>
-        </w:rPr>
-        <w:t xml:space="preserve"> </w:t>
-      </w:r>
-      <w:r>
-        <w:t>Decision</w:t>
-      </w:r>
-      <w:r>
-        <w:rPr>
-          <w:lang w:val="ru-RU"/>
-        </w:rPr>
-        <w:t xml:space="preserve"> </w:t>
-      </w:r>
-      <w:r>
-        <w:t>Records</w:t>
-      </w:r>
-      <w:r>
-        <w:rPr>
-          <w:lang w:val="ru-RU"/>
-        </w:rPr>
-        <w:t xml:space="preserve">), </w:t>
-      </w:r>
-      <w:r>
-        <w:t>CHANGELOG</w:t>
-      </w:r>
-      <w:r>
-        <w:rPr>
-          <w:lang w:val="ru-RU"/>
-        </w:rPr>
-        <w:t>, двуязычные инструкции — создаются вместе с реализацией. Решения зафиксированы с обоснованием, а не теряются в голове.</w:t>
-      </w:r>
-    </w:p>
-    <w:p>
-      <w:pPr>
-        <w:spacing w:after="120"/>
-        <w:rPr>
-          <w:lang w:val="ru-RU"/>
-        </w:rPr>
-      </w:pPr>
-      <w:r>
-        <w:rPr>
-          <w:lang w:val="ru-RU"/>
-        </w:rPr>
-        <w:t>*</w:t>
-      </w:r>
-      <w:proofErr w:type="gramStart"/>
-      <w:r>
-        <w:rPr>
-          <w:lang w:val="ru-RU"/>
-        </w:rPr>
-        <w:t>Системность.*</w:t>
-      </w:r>
-      <w:proofErr w:type="gramEnd"/>
-      <w:r>
-        <w:rPr>
-          <w:lang w:val="ru-RU"/>
-        </w:rPr>
-        <w:t xml:space="preserve"> </w:t>
-      </w:r>
-      <w:r>
-        <w:t>CI</w:t>
-      </w:r>
-      <w:r>
-        <w:rPr>
-          <w:lang w:val="ru-RU"/>
-        </w:rPr>
-        <w:t>/</w:t>
-      </w:r>
-      <w:r>
-        <w:t>CD</w:t>
-      </w:r>
-      <w:r>
-        <w:rPr>
-          <w:lang w:val="ru-RU"/>
-        </w:rPr>
-        <w:t xml:space="preserve"> в </w:t>
-      </w:r>
-      <w:r>
-        <w:t>GitHub</w:t>
-      </w:r>
-      <w:r>
-        <w:rPr>
-          <w:lang w:val="ru-RU"/>
-        </w:rPr>
-        <w:t xml:space="preserve"> </w:t>
-      </w:r>
-      <w:r>
-        <w:t>Actions</w:t>
-      </w:r>
-      <w:r>
-        <w:rPr>
-          <w:lang w:val="ru-RU"/>
-        </w:rPr>
-        <w:t xml:space="preserve">, </w:t>
-      </w:r>
-      <w:r>
-        <w:t>secrets</w:t>
-      </w:r>
-      <w:r>
-        <w:rPr>
-          <w:lang w:val="ru-RU"/>
-        </w:rPr>
-        <w:t>-</w:t>
-      </w:r>
-      <w:r>
-        <w:t>check</w:t>
-      </w:r>
-      <w:r>
-        <w:rPr>
-          <w:lang w:val="ru-RU"/>
-        </w:rPr>
-        <w:t xml:space="preserve"> перед каждым </w:t>
-      </w:r>
-      <w:r>
-        <w:t>push</w:t>
-      </w:r>
-      <w:r>
-        <w:rPr>
-          <w:lang w:val="ru-RU"/>
-        </w:rPr>
-        <w:t xml:space="preserve">, </w:t>
-      </w:r>
-      <w:proofErr w:type="spellStart"/>
-      <w:r>
-        <w:t>shellcheck</w:t>
-      </w:r>
-      <w:proofErr w:type="spellEnd"/>
-      <w:r>
-        <w:rPr>
-          <w:lang w:val="ru-RU"/>
-        </w:rPr>
-        <w:t xml:space="preserve"> для </w:t>
-      </w:r>
-      <w:r>
-        <w:t>bash</w:t>
-      </w:r>
-      <w:r>
-        <w:rPr>
-          <w:lang w:val="ru-RU"/>
-        </w:rPr>
-        <w:t xml:space="preserve">-скриптов, </w:t>
-      </w:r>
-      <w:proofErr w:type="spellStart"/>
-      <w:r>
-        <w:t>goss</w:t>
-      </w:r>
-      <w:proofErr w:type="spellEnd"/>
-      <w:r>
-        <w:rPr>
-          <w:lang w:val="ru-RU"/>
-        </w:rPr>
-        <w:t xml:space="preserve">-тесты — агент знает </w:t>
-      </w:r>
-      <w:r>
-        <w:t>open</w:t>
-      </w:r>
-      <w:r>
-        <w:rPr>
-          <w:lang w:val="ru-RU"/>
-        </w:rPr>
-        <w:t>-</w:t>
-      </w:r>
-      <w:r>
-        <w:t>source</w:t>
-      </w:r>
-      <w:r>
-        <w:rPr>
-          <w:lang w:val="ru-RU"/>
-        </w:rPr>
-        <w:t xml:space="preserve"> конвенции и применяет их автоматически.</w:t>
-      </w:r>
-    </w:p>
-    <w:p>
-      <w:pPr>
-        <w:spacing w:after="120"/>
-        <w:rPr>
-          <w:lang w:val="ru-RU"/>
-        </w:rPr>
-      </w:pPr>
-      <w:r>
-        <w:rPr>
-          <w:b/>
-          <w:lang w:val="ru-RU"/>
-        </w:rPr>
-        <w:t>Что требует контроля человека:</w:t>
-      </w:r>
-    </w:p>
-    <w:p>
-      <w:pPr>
-        <w:spacing w:after="120"/>
-        <w:rPr>
-          <w:lang w:val="ru-RU"/>
-        </w:rPr>
-      </w:pPr>
-      <w:r>
-        <w:rPr>
-          <w:lang w:val="ru-RU"/>
-        </w:rPr>
-        <w:t xml:space="preserve">Агент не знает ваше железо. Нужно объяснять детали: какой чип в </w:t>
-      </w:r>
-      <w:r>
-        <w:t>USB</w:t>
-      </w:r>
-      <w:r>
-        <w:rPr>
-          <w:lang w:val="ru-RU"/>
-        </w:rPr>
-        <w:t xml:space="preserve">-мосте, реальное </w:t>
-      </w:r>
-      <w:r>
-        <w:t>RAM</w:t>
-      </w:r>
-      <w:r>
-        <w:rPr>
-          <w:lang w:val="ru-RU"/>
-        </w:rPr>
-        <w:t xml:space="preserve">, версию </w:t>
-      </w:r>
-      <w:r>
-        <w:t>kernel</w:t>
-      </w:r>
-      <w:r>
-        <w:rPr>
-          <w:lang w:val="ru-RU"/>
-        </w:rPr>
-        <w:t xml:space="preserve">, что на </w:t>
-      </w:r>
-      <w:r>
-        <w:t>VPS</w:t>
-      </w:r>
-      <w:r>
-        <w:rPr>
-          <w:lang w:val="ru-RU"/>
-        </w:rPr>
-        <w:t xml:space="preserve"> нельзя трогат</w:t>
-      </w:r>
-      <w:r>
-        <w:rPr>
-          <w:lang w:val="ru-RU"/>
-        </w:rPr>
-        <w:t>ь. Без этого контекста рекомендации будут общими.</w:t>
-      </w:r>
-    </w:p>
-    <w:p>
-      <w:pPr>
-        <w:spacing w:after="120"/>
-        <w:rPr>
-          <w:lang w:val="ru-RU"/>
-        </w:rPr>
-      </w:pPr>
-      <w:r>
-        <w:t>Firewall</w:t>
-      </w:r>
-      <w:r>
-        <w:rPr>
-          <w:lang w:val="ru-RU"/>
-        </w:rPr>
-        <w:t xml:space="preserve">, </w:t>
-      </w:r>
-      <w:proofErr w:type="spellStart"/>
-      <w:r>
-        <w:t>fstab</w:t>
-      </w:r>
-      <w:proofErr w:type="spellEnd"/>
-      <w:r>
-        <w:rPr>
-          <w:lang w:val="ru-RU"/>
-        </w:rPr>
-        <w:t>, пароли — проверять самому. Агент напишет конфиг, но финальная ответственность за безопасность — ваша.</w:t>
-      </w:r>
-    </w:p>
-    <w:p>
-      <w:pPr>
-        <w:spacing w:after="120"/>
-        <w:rPr>
-          <w:lang w:val="ru-RU"/>
-        </w:rPr>
-      </w:pPr>
-      <w:r>
-        <w:rPr>
-          <w:lang w:val="ru-RU"/>
-        </w:rPr>
-        <w:t xml:space="preserve">Контекст сессии конечен. Решается </w:t>
-      </w:r>
-      <w:r>
-        <w:rPr>
-          <w:rFonts w:ascii="Courier New" w:hAnsi="Courier New"/>
-          <w:sz w:val="20"/>
-        </w:rPr>
-        <w:t>AGENTS</w:t>
-      </w:r>
-      <w:r>
-        <w:rPr>
-          <w:rFonts w:ascii="Courier New" w:hAnsi="Courier New"/>
-          <w:sz w:val="20"/>
-          <w:lang w:val="ru-RU"/>
-        </w:rPr>
-        <w:t>.</w:t>
-      </w:r>
-      <w:r>
-        <w:rPr>
-          <w:rFonts w:ascii="Courier New" w:hAnsi="Courier New"/>
-          <w:sz w:val="20"/>
-        </w:rPr>
-        <w:t>md</w:t>
-      </w:r>
-      <w:r>
-        <w:rPr>
-          <w:lang w:val="ru-RU"/>
-        </w:rPr>
-        <w:t xml:space="preserve"> и </w:t>
-      </w:r>
-      <w:r>
-        <w:rPr>
-          <w:rFonts w:ascii="Courier New" w:hAnsi="Courier New"/>
-          <w:sz w:val="20"/>
-        </w:rPr>
-        <w:t>CLAUDE</w:t>
-      </w:r>
-      <w:r>
-        <w:rPr>
-          <w:rFonts w:ascii="Courier New" w:hAnsi="Courier New"/>
-          <w:sz w:val="20"/>
-          <w:lang w:val="ru-RU"/>
-        </w:rPr>
-        <w:t>.</w:t>
-      </w:r>
-      <w:r>
-        <w:rPr>
-          <w:rFonts w:ascii="Courier New" w:hAnsi="Courier New"/>
-          <w:sz w:val="20"/>
-        </w:rPr>
-        <w:t>md</w:t>
-      </w:r>
-      <w:r>
-        <w:rPr>
-          <w:lang w:val="ru-RU"/>
-        </w:rPr>
-        <w:t xml:space="preserve"> — файлы, которые агент читает п</w:t>
-      </w:r>
-      <w:r>
-        <w:rPr>
-          <w:lang w:val="ru-RU"/>
-        </w:rPr>
-        <w:t>ри старте. Там зафиксировано актуальное состояние системы, жёсткие запреты и архитектурные решения.</w:t>
-      </w:r>
-    </w:p>
-    <w:p>
-      <w:pPr>
-        <w:spacing w:after="120"/>
-        <w:rPr>
-          <w:lang w:val="ru-RU"/>
-        </w:rPr>
-      </w:pPr>
-      <w:r>
-        <w:rPr>
-          <w:b/>
-          <w:lang w:val="ru-RU"/>
-        </w:rPr>
-        <w:t>Открытые вопросы (честно):</w:t>
-      </w:r>
-    </w:p>
-    <w:p>
-      <w:pPr>
-        <w:spacing w:after="120"/>
-        <w:rPr>
-          <w:lang w:val="ru-RU"/>
-        </w:rPr>
-      </w:pPr>
-      <w:r>
-        <w:rPr>
-          <w:lang w:val="ru-RU"/>
-        </w:rPr>
-        <w:t xml:space="preserve">- </w:t>
-      </w:r>
-      <w:r>
-        <w:t>Docker</w:t>
-      </w:r>
-      <w:r>
-        <w:rPr>
-          <w:lang w:val="ru-RU"/>
-        </w:rPr>
-        <w:t xml:space="preserve"> 20.10.7 устарел — обновить нетривиально на </w:t>
-      </w:r>
-      <w:proofErr w:type="spellStart"/>
-      <w:r>
-        <w:t>JetPack</w:t>
-      </w:r>
-      <w:proofErr w:type="spellEnd"/>
-    </w:p>
-    <w:p>
-      <w:pPr>
-        <w:spacing w:after="120"/>
-        <w:rPr>
-          <w:lang w:val="ru-RU"/>
-        </w:rPr>
-      </w:pPr>
-      <w:r>
-        <w:rPr>
-          <w:lang w:val="ru-RU"/>
-        </w:rPr>
-        <w:t xml:space="preserve">- </w:t>
-      </w:r>
-      <w:r>
-        <w:t>off</w:t>
-      </w:r>
-      <w:r>
-        <w:rPr>
-          <w:lang w:val="ru-RU"/>
-        </w:rPr>
-        <w:t>-</w:t>
-      </w:r>
-      <w:r>
-        <w:t>site</w:t>
-      </w:r>
-      <w:r>
-        <w:rPr>
-          <w:lang w:val="ru-RU"/>
-        </w:rPr>
-        <w:t xml:space="preserve"> </w:t>
-      </w:r>
-      <w:r>
-        <w:t>backup</w:t>
-      </w:r>
-      <w:r>
-        <w:rPr>
-          <w:lang w:val="ru-RU"/>
-        </w:rPr>
-        <w:t xml:space="preserve"> не настроен — </w:t>
-      </w:r>
-      <w:proofErr w:type="spellStart"/>
-      <w:r>
-        <w:t>restic</w:t>
-      </w:r>
-      <w:proofErr w:type="spellEnd"/>
-      <w:r>
-        <w:rPr>
-          <w:lang w:val="ru-RU"/>
-        </w:rPr>
-        <w:t xml:space="preserve"> скрипты готовы, </w:t>
-      </w:r>
-      <w:r>
-        <w:t>backup</w:t>
-      </w:r>
-      <w:r>
-        <w:rPr>
-          <w:lang w:val="ru-RU"/>
-        </w:rPr>
-        <w:t xml:space="preserve"> на </w:t>
-      </w:r>
-      <w:r>
-        <w:t>VPS</w:t>
-      </w:r>
-      <w:r>
-        <w:rPr>
-          <w:lang w:val="ru-RU"/>
-        </w:rPr>
-        <w:t xml:space="preserve"> </w:t>
-      </w:r>
-      <w:r>
-        <w:rPr>
-          <w:lang w:val="ru-RU"/>
-        </w:rPr>
-        <w:t>не запущен</w:t>
-      </w:r>
-    </w:p>
-    <w:p>
-      <w:pPr>
-        <w:spacing w:after="120"/>
-        <w:rPr>
-          <w:lang w:val="ru-RU"/>
-        </w:rPr>
-      </w:pPr>
-      <w:r>
-        <w:rPr>
-          <w:lang w:val="ru-RU"/>
-        </w:rPr>
-        <w:t xml:space="preserve">- </w:t>
-      </w:r>
-      <w:r>
-        <w:t>ML</w:t>
-      </w:r>
-      <w:r>
-        <w:rPr>
-          <w:lang w:val="ru-RU"/>
-        </w:rPr>
-        <w:t xml:space="preserve"> в </w:t>
-      </w:r>
-      <w:proofErr w:type="spellStart"/>
-      <w:r>
-        <w:t>Immich</w:t>
-      </w:r>
-      <w:proofErr w:type="spellEnd"/>
-      <w:r>
-        <w:rPr>
-          <w:lang w:val="ru-RU"/>
-        </w:rPr>
-        <w:t xml:space="preserve"> отключён — </w:t>
-      </w:r>
-      <w:r>
-        <w:t>Jetson</w:t>
-      </w:r>
-      <w:r>
-        <w:rPr>
-          <w:lang w:val="ru-RU"/>
-        </w:rPr>
-        <w:t xml:space="preserve"> 4 </w:t>
-      </w:r>
-      <w:r>
-        <w:t>GB</w:t>
-      </w:r>
-      <w:r>
-        <w:rPr>
-          <w:lang w:val="ru-RU"/>
-        </w:rPr>
-        <w:t xml:space="preserve"> без </w:t>
-      </w:r>
-      <w:r>
-        <w:t>swap</w:t>
-      </w:r>
-      <w:r>
-        <w:rPr>
-          <w:lang w:val="ru-RU"/>
-        </w:rPr>
-        <w:t xml:space="preserve"> не тянет распознавание лиц</w:t>
-      </w:r>
-    </w:p>
-    <w:p>
-      <w:pPr>
-        <w:spacing w:after="120"/>
-        <w:rPr>
-          <w:lang w:val="ru-RU"/>
-        </w:rPr>
-      </w:pPr>
-      <w:r>
-        <w:rPr>
-          <w:lang w:val="ru-RU"/>
-        </w:rPr>
-        <w:t xml:space="preserve">- </w:t>
-      </w:r>
-      <w:r>
-        <w:t>SMART</w:t>
-      </w:r>
-      <w:r>
-        <w:rPr>
-          <w:lang w:val="ru-RU"/>
-        </w:rPr>
-        <w:t xml:space="preserve"> у </w:t>
-      </w:r>
-      <w:r>
-        <w:t>JMS</w:t>
-      </w:r>
-      <w:r>
-        <w:rPr>
-          <w:lang w:val="ru-RU"/>
-        </w:rPr>
-        <w:t xml:space="preserve">583 базовый — </w:t>
-      </w:r>
-      <w:proofErr w:type="spellStart"/>
-      <w:r>
-        <w:t>smartmontools</w:t>
-      </w:r>
-      <w:proofErr w:type="spellEnd"/>
-      <w:r>
-        <w:rPr>
-          <w:lang w:val="ru-RU"/>
-        </w:rPr>
-        <w:t xml:space="preserve"> 6.6 не поддерживает полный </w:t>
-      </w:r>
-      <w:r>
-        <w:t>SAT</w:t>
-      </w:r>
-      <w:r>
-        <w:rPr>
-          <w:lang w:val="ru-RU"/>
-        </w:rPr>
-        <w:t xml:space="preserve"> </w:t>
-      </w:r>
-      <w:r>
-        <w:t>passthrough</w:t>
-      </w:r>
-    </w:p>
-    <w:p>
-      <w:pPr>
-        <w:pBdr>
-          <w:bottom w:val="single" w:sz="6" w:space="1" w:color="CCCCCC"/>
-        </w:pBdr>
-        <w:rPr>
-          <w:lang w:val="ru-RU"/>
-        </w:rPr>
-      </w:pPr>
-    </w:p>
-    <w:p>
-      <w:pPr>
-        <w:pStyle w:val="1"/>
-        <w:rPr>
-          <w:lang w:val="ru-RU"/>
-        </w:rPr>
-      </w:pPr>
-      <w:r>
-        <w:rPr>
-          <w:color w:val="16213E"/>
-          <w:sz w:val="30"/>
-          <w:lang w:val="ru-RU"/>
-        </w:rPr>
         <w:t>Вывод</w:t>
       </w:r>
     </w:p>
@@ -8721,167 +8554,12 @@
         </w:rPr>
       </w:pPr>
       <w:r>
-        <w:rPr>
-          <w:b/>
-          <w:lang w:val="ru-RU"/>
-        </w:rPr>
-        <w:t>[</w:t>
-      </w:r>
-      <w:proofErr w:type="spellStart"/>
-      <w:r>
-        <w:rPr>
-          <w:b/>
-        </w:rPr>
-        <w:t>github</w:t>
-      </w:r>
-      <w:proofErr w:type="spellEnd"/>
-      <w:r>
-        <w:rPr>
-          <w:b/>
-          <w:lang w:val="ru-RU"/>
-        </w:rPr>
-        <w:t>.</w:t>
-      </w:r>
-      <w:r>
-        <w:rPr>
-          <w:b/>
-        </w:rPr>
-        <w:t>com</w:t>
-      </w:r>
-      <w:r>
-        <w:rPr>
-          <w:b/>
-          <w:lang w:val="ru-RU"/>
-        </w:rPr>
-        <w:t>/</w:t>
-      </w:r>
-      <w:proofErr w:type="spellStart"/>
-      <w:r>
-        <w:rPr>
-          <w:b/>
-        </w:rPr>
-        <w:t>AlexeyBorovskoy</w:t>
-      </w:r>
-      <w:proofErr w:type="spellEnd"/>
-      <w:r>
-        <w:rPr>
-          <w:b/>
-          <w:lang w:val="ru-RU"/>
-        </w:rPr>
-        <w:t>/</w:t>
-      </w:r>
-      <w:r>
-        <w:rPr>
-          <w:b/>
-        </w:rPr>
-        <w:t>Nasa</w:t>
-      </w:r>
-      <w:r>
-        <w:rPr>
-          <w:b/>
-          <w:lang w:val="ru-RU"/>
-        </w:rPr>
-        <w:t>_</w:t>
-      </w:r>
-      <w:proofErr w:type="gramStart"/>
-      <w:r>
-        <w:rPr>
-          <w:b/>
-        </w:rPr>
-        <w:t>home</w:t>
-      </w:r>
-      <w:r>
-        <w:rPr>
-          <w:b/>
-          <w:lang w:val="ru-RU"/>
-        </w:rPr>
-        <w:t>](</w:t>
-      </w:r>
-      <w:proofErr w:type="gramEnd"/>
-      <w:r>
-        <w:rPr>
-          <w:b/>
-        </w:rPr>
-        <w:t>https</w:t>
-      </w:r>
-      <w:r>
-        <w:rPr>
-          <w:b/>
-          <w:lang w:val="ru-RU"/>
-        </w:rPr>
-        <w:t>://</w:t>
-      </w:r>
-      <w:proofErr w:type="spellStart"/>
-      <w:r>
-        <w:rPr>
-          <w:b/>
-        </w:rPr>
-        <w:t>github</w:t>
-      </w:r>
-      <w:proofErr w:type="spellEnd"/>
-      <w:r>
-        <w:rPr>
-          <w:b/>
-          <w:lang w:val="ru-RU"/>
-        </w:rPr>
-        <w:t>.</w:t>
-      </w:r>
-      <w:r>
-        <w:rPr>
-          <w:b/>
-        </w:rPr>
-        <w:t>com</w:t>
-      </w:r>
-      <w:r>
-        <w:rPr>
-          <w:b/>
-          <w:lang w:val="ru-RU"/>
-        </w:rPr>
-        <w:t>/</w:t>
-      </w:r>
-      <w:proofErr w:type="spellStart"/>
-      <w:r>
-        <w:rPr>
-          <w:b/>
-        </w:rPr>
-        <w:t>AlexeyBorovskoy</w:t>
-      </w:r>
-      <w:proofErr w:type="spellEnd"/>
-      <w:r>
-        <w:rPr>
-          <w:b/>
-          <w:lang w:val="ru-RU"/>
-        </w:rPr>
-        <w:t>/</w:t>
-      </w:r>
-      <w:r>
-        <w:rPr>
-          <w:b/>
-        </w:rPr>
-        <w:t>Nasa</w:t>
-      </w:r>
-      <w:r>
-        <w:rPr>
-          <w:b/>
-          <w:lang w:val="ru-RU"/>
-        </w:rPr>
-        <w:t>_</w:t>
-      </w:r>
-      <w:r>
-        <w:rPr>
-          <w:b/>
-        </w:rPr>
-        <w:t>home</w:t>
-      </w:r>
-      <w:r>
-        <w:rPr>
-          <w:b/>
-          <w:lang w:val="ru-RU"/>
-        </w:rPr>
-        <w:t>)</w:t>
+        <w:t>[github.com/AlexeyBorovskoy/NAS_Jetson_Nano](https://github.com/AlexeyBorovskoy/NAS_Jetson_Nano)</w:t>
       </w:r>
     </w:p>
     <w:sectPr>
+      <w:headerReference w:type="default" r:id="rId8"/>
+      <w:footerReference w:type="default" r:id="rId9"/>
       <w:pgSz w:w="12240" w:h="15840"/>
       <w:pgMar w:top="1134" w:right="1134" w:bottom="1134" w:left="1701" w:header="720" w:footer="720" w:gutter="0"/>
       <w:cols w:space="720"/>
@@ -8889,6 +8567,26 @@
     </w:sectPr>
   </w:body>
 </w:document>
+</file>
+
+<file path=word/footer1.xml><?xml version="1.0" encoding="utf-8"?>
+<w:ftr xmlns:m="http://schemas.openxmlformats.org/officeDocument/2006/math" xmlns:mc="http://schemas.openxmlformats.org/markup-compatibility/2006" xmlns:mo="http://schemas.microsoft.com/office/mac/office/2008/main" xmlns:mv="urn:schemas-microsoft-com:mac:vml" xmlns:o="urn:schemas-microsoft-com:office:office" xmlns:r="http://schemas.openxmlformats.org/officeDocument/2006/relationships" xmlns:v="urn:schemas-microsoft-com:vml" xmlns:w10="urn:schemas-microsoft-com:office:word" xmlns:w14="http://schemas.microsoft.com/office/word/2010/wordml" xmlns:w="http://schemas.openxmlformats.org/wordprocessingml/2006/main" xmlns:wne="http://schemas.microsoft.com/office/word/2006/wordml" xmlns:wp14="http://schemas.microsoft.com/office/word/2010/wordprocessingDrawing" xmlns:wp="http://schemas.openxmlformats.org/drawingml/2006/wordprocessingDrawing" xmlns:wpc="http://schemas.microsoft.com/office/word/2010/wordprocessingCanvas" xmlns:wpg="http://schemas.microsoft.com/office/word/2010/wordprocessingGroup" xmlns:wpi="http://schemas.microsoft.com/office/word/2010/wordprocessingInk" xmlns:wps="http://schemas.microsoft.com/office/word/2010/wordprocessingShape" mc:Ignorable="w14 wp14">
+  <w:p>
+    <w:pPr>
+      <w:pStyle w:val="Footer"/>
+    </w:pPr>
+  </w:p>
+</w:ftr>
+</file>
+
+<file path=word/header1.xml><?xml version="1.0" encoding="utf-8"?>
+<w:hdr xmlns:m="http://schemas.openxmlformats.org/officeDocument/2006/math" xmlns:mc="http://schemas.openxmlformats.org/markup-compatibility/2006" xmlns:mo="http://schemas.microsoft.com/office/mac/office/2008/main" xmlns:mv="urn:schemas-microsoft-com:mac:vml" xmlns:o="urn:schemas-microsoft-com:office:office" xmlns:r="http://schemas.openxmlformats.org/officeDocument/2006/relationships" xmlns:v="urn:schemas-microsoft-com:vml" xmlns:w10="urn:schemas-microsoft-com:office:word" xmlns:w14="http://schemas.microsoft.com/office/word/2010/wordml" xmlns:w="http://schemas.openxmlformats.org/wordprocessingml/2006/main" xmlns:wne="http://schemas.microsoft.com/office/word/2006/wordml" xmlns:wp14="http://schemas.microsoft.com/office/word/2010/wordprocessingDrawing" xmlns:wp="http://schemas.openxmlformats.org/drawingml/2006/wordprocessingDrawing" xmlns:wpc="http://schemas.microsoft.com/office/word/2010/wordprocessingCanvas" xmlns:wpg="http://schemas.microsoft.com/office/word/2010/wordprocessingGroup" xmlns:wpi="http://schemas.microsoft.com/office/word/2010/wordprocessingInk" xmlns:wps="http://schemas.microsoft.com/office/word/2010/wordprocessingShape" mc:Ignorable="w14 wp14">
+  <w:p>
+    <w:pPr>
+      <w:pStyle w:val="Header"/>
+    </w:pPr>
+  </w:p>
+</w:hdr>
 </file>
 
 <file path=word/numbering.xml><?xml version="1.0" encoding="utf-8"?>

</xml_diff>